<commit_message>
docs(db): finalizar diseño y script SQL de Base de Datos V2
- Agrega script SQL definitivo ikernell_v2_FINAL.sql, alineado con
  el diseño lógico 06.6 (15 tablas, incluye asignacion_proyecto,
  mensaje_contacto, notificacion y trazabilidad completas)
- Agrega documentación de arquitectura: 06.5-estandares-base-de-datos.md,
  06.6-diseno-logico-base-de-datos.md y 13-reglas-de-negocio.md
- Reorganiza archivos de la BD legacy bajo docs/Base de datos/DB Legacy/
- Convierte Historias de Usuario y Requerimientos de .docx a .md
  para permitir diff legible y control de versiones real
- Elimina archivos obsoletos del modelo relacional anterior
  (MER, diagrama .png, script de caso de estudio v0)
- Agrega checklist de entregable del reto
</commit_message>
<xml_diff>
--- a/docs/Historias de Usuario/HU-05 - IKernell Soluciones Software.docx
+++ b/docs/Historias de Usuario/HU-05 - IKernell Soluciones Software.docx
@@ -13,9 +13,6 @@
         <w:ind w:left="0" w:right="0" w:firstLine="0"/>
         <w:jc w:val="left"/>
         <w:rPr>
-          <w:rFonts w:ascii="Arial" w:cs="Arial" w:eastAsia="Arial" w:hAnsi="Arial"/>
-          <w:b w:val="0"/>
-          <w:bCs w:val="0"/>
           <w:i w:val="0"/>
           <w:iCs w:val="0"/>
           <w:smallCaps w:val="0"/>
@@ -93,7 +90,6 @@
               <w:ind w:left="0" w:right="0" w:firstLine="0"/>
               <w:jc w:val="center"/>
               <w:rPr>
-                <w:rFonts w:ascii="Calibri" w:cs="Calibri" w:eastAsia="Calibri" w:hAnsi="Calibri"/>
                 <w:b w:val="1"/>
                 <w:bCs w:val="1"/>
                 <w:i w:val="0"/>
@@ -160,7 +156,6 @@
               <w:ind w:left="0" w:right="0" w:firstLine="0"/>
               <w:jc w:val="left"/>
               <w:rPr>
-                <w:rFonts w:ascii="Calibri" w:cs="Calibri" w:eastAsia="Calibri" w:hAnsi="Calibri"/>
                 <w:b w:val="1"/>
                 <w:bCs w:val="1"/>
                 <w:i w:val="0"/>
@@ -192,11 +187,6 @@
                 <w:rtl w:val="0"/>
               </w:rPr>
               <w:t xml:space="preserve">Código:</w:t>
-            </w:r>
-            <w:r>
-              <w:rPr>
-                <w:rtl w:val="0"/>
-              </w:rPr>
             </w:r>
           </w:p>
         </w:tc>
@@ -224,8 +214,6 @@
             </w:pPr>
             <w:r>
               <w:rPr>
-                <w:b w:val="0"/>
-                <w:bCs w:val="0"/>
                 <w:i w:val="0"/>
                 <w:iCs w:val="0"/>
                 <w:smallCaps w:val="0"/>
@@ -269,7 +257,6 @@
               <w:ind w:left="0" w:right="0" w:firstLine="0"/>
               <w:jc w:val="left"/>
               <w:rPr>
-                <w:rFonts w:ascii="Calibri" w:cs="Calibri" w:eastAsia="Calibri" w:hAnsi="Calibri"/>
                 <w:b w:val="1"/>
                 <w:bCs w:val="1"/>
                 <w:i w:val="0"/>
@@ -360,7 +347,6 @@
               <w:ind w:left="0" w:right="0" w:firstLine="0"/>
               <w:jc w:val="left"/>
               <w:rPr>
-                <w:rFonts w:ascii="Calibri" w:cs="Calibri" w:eastAsia="Calibri" w:hAnsi="Calibri"/>
                 <w:b w:val="1"/>
                 <w:bCs w:val="1"/>
                 <w:i w:val="0"/>
@@ -393,11 +379,6 @@
               </w:rPr>
               <w:t xml:space="preserve">Complejidad:</w:t>
             </w:r>
-            <w:r>
-              <w:rPr>
-                <w:rtl w:val="0"/>
-              </w:rPr>
-            </w:r>
           </w:p>
         </w:tc>
         <w:tc>
@@ -421,9 +402,6 @@
               <w:ind w:left="0" w:right="0" w:firstLine="0"/>
               <w:jc w:val="left"/>
               <w:rPr>
-                <w:rFonts w:ascii="Calibri" w:cs="Calibri" w:eastAsia="Calibri" w:hAnsi="Calibri"/>
-                <w:b w:val="0"/>
-                <w:bCs w:val="0"/>
                 <w:i w:val="0"/>
                 <w:iCs w:val="0"/>
                 <w:smallCaps w:val="0"/>
@@ -476,7 +454,6 @@
               <w:ind w:left="0" w:right="0" w:firstLine="0"/>
               <w:jc w:val="left"/>
               <w:rPr>
-                <w:rFonts w:ascii="Calibri" w:cs="Calibri" w:eastAsia="Calibri" w:hAnsi="Calibri"/>
                 <w:b w:val="1"/>
                 <w:bCs w:val="1"/>
                 <w:i w:val="0"/>
@@ -509,11 +486,6 @@
               </w:rPr>
               <w:t xml:space="preserve">HU Relacionada:</w:t>
             </w:r>
-            <w:r>
-              <w:rPr>
-                <w:rtl w:val="0"/>
-              </w:rPr>
-            </w:r>
           </w:p>
         </w:tc>
         <w:tc>
@@ -537,9 +509,6 @@
               <w:ind w:left="0" w:right="0" w:firstLine="0"/>
               <w:jc w:val="left"/>
               <w:rPr>
-                <w:rFonts w:ascii="Calibri" w:cs="Calibri" w:eastAsia="Calibri" w:hAnsi="Calibri"/>
-                <w:b w:val="0"/>
-                <w:bCs w:val="0"/>
                 <w:i w:val="0"/>
                 <w:iCs w:val="0"/>
                 <w:smallCaps w:val="0"/>
@@ -592,7 +561,6 @@
               <w:ind w:left="0" w:right="0" w:firstLine="0"/>
               <w:jc w:val="left"/>
               <w:rPr>
-                <w:rFonts w:ascii="Calibri" w:cs="Calibri" w:eastAsia="Calibri" w:hAnsi="Calibri"/>
                 <w:b w:val="1"/>
                 <w:bCs w:val="1"/>
                 <w:i w:val="0"/>
@@ -625,11 +593,6 @@
               </w:rPr>
               <w:t xml:space="preserve">Módulo:</w:t>
             </w:r>
-            <w:r>
-              <w:rPr>
-                <w:rtl w:val="0"/>
-              </w:rPr>
-            </w:r>
           </w:p>
         </w:tc>
         <w:tc>
@@ -652,9 +615,6 @@
               <w:ind w:left="0" w:right="0" w:firstLine="0"/>
               <w:jc w:val="left"/>
               <w:rPr>
-                <w:rFonts w:ascii="Calibri" w:cs="Calibri" w:eastAsia="Calibri" w:hAnsi="Calibri"/>
-                <w:b w:val="0"/>
-                <w:bCs w:val="0"/>
                 <w:i w:val="0"/>
                 <w:iCs w:val="0"/>
                 <w:smallCaps w:val="0"/>
@@ -709,7 +669,6 @@
               <w:ind w:left="0" w:right="0" w:firstLine="0"/>
               <w:jc w:val="left"/>
               <w:rPr>
-                <w:rFonts w:ascii="Calibri" w:cs="Calibri" w:eastAsia="Calibri" w:hAnsi="Calibri"/>
                 <w:b w:val="1"/>
                 <w:bCs w:val="1"/>
                 <w:i w:val="0"/>
@@ -769,7 +728,6 @@
               <w:ind w:left="0" w:right="0" w:firstLine="0"/>
               <w:jc w:val="left"/>
               <w:rPr>
-                <w:rFonts w:ascii="Calibri" w:cs="Calibri" w:eastAsia="Calibri" w:hAnsi="Calibri"/>
                 <w:b w:val="1"/>
                 <w:bCs w:val="1"/>
                 <w:i w:val="0"/>
@@ -802,11 +760,6 @@
               </w:rPr>
               <w:t xml:space="preserve">Yo como</w:t>
             </w:r>
-            <w:r>
-              <w:rPr>
-                <w:rtl w:val="0"/>
-              </w:rPr>
-            </w:r>
           </w:p>
         </w:tc>
         <w:tc>
@@ -829,9 +782,6 @@
               <w:ind w:left="0" w:right="0" w:firstLine="0"/>
               <w:jc w:val="both"/>
               <w:rPr>
-                <w:rFonts w:ascii="Calibri" w:cs="Calibri" w:eastAsia="Calibri" w:hAnsi="Calibri"/>
-                <w:b w:val="0"/>
-                <w:bCs w:val="0"/>
                 <w:i w:val="0"/>
                 <w:iCs w:val="0"/>
                 <w:smallCaps w:val="0"/>
@@ -894,9 +844,6 @@
               <w:ind w:left="0" w:right="0" w:firstLine="0"/>
               <w:jc w:val="left"/>
               <w:rPr>
-                <w:rFonts w:ascii="Calibri" w:cs="Calibri" w:eastAsia="Calibri" w:hAnsi="Calibri"/>
-                <w:b w:val="0"/>
-                <w:bCs w:val="0"/>
                 <w:i w:val="0"/>
                 <w:iCs w:val="0"/>
                 <w:smallCaps w:val="0"/>
@@ -936,7 +883,6 @@
               <w:ind w:left="0" w:right="0" w:firstLine="0"/>
               <w:jc w:val="left"/>
               <w:rPr>
-                <w:rFonts w:ascii="Calibri" w:cs="Calibri" w:eastAsia="Calibri" w:hAnsi="Calibri"/>
                 <w:b w:val="1"/>
                 <w:bCs w:val="1"/>
                 <w:i w:val="0"/>
@@ -969,11 +915,6 @@
               </w:rPr>
               <w:t xml:space="preserve">Requiero</w:t>
             </w:r>
-            <w:r>
-              <w:rPr>
-                <w:rtl w:val="0"/>
-              </w:rPr>
-            </w:r>
           </w:p>
         </w:tc>
         <w:tc>
@@ -996,9 +937,6 @@
               <w:ind w:left="0" w:right="0" w:firstLine="0"/>
               <w:jc w:val="both"/>
               <w:rPr>
-                <w:rFonts w:ascii="Calibri" w:cs="Calibri" w:eastAsia="Calibri" w:hAnsi="Calibri"/>
-                <w:b w:val="0"/>
-                <w:bCs w:val="0"/>
                 <w:i w:val="0"/>
                 <w:iCs w:val="0"/>
                 <w:smallCaps w:val="0"/>
@@ -1015,7 +953,7 @@
               <w:rPr>
                 <w:rtl w:val="0"/>
               </w:rPr>
-              <w:t xml:space="preserve">registrar el perfil completo de un desarrollador (datos personales, especialidad, tipo de trabajador, foto y proyecto asignado) y poder buscar, modificar e inhabilitar perfiles existentes</w:t>
+              <w:t xml:space="preserve">registrar y administrar la información de los desarrolladores de la empresa.</w:t>
             </w:r>
             <w:r>
               <w:rPr>
@@ -1061,9 +999,6 @@
               <w:ind w:left="0" w:right="0" w:firstLine="0"/>
               <w:jc w:val="left"/>
               <w:rPr>
-                <w:rFonts w:ascii="Calibri" w:cs="Calibri" w:eastAsia="Calibri" w:hAnsi="Calibri"/>
-                <w:b w:val="0"/>
-                <w:bCs w:val="0"/>
                 <w:i w:val="0"/>
                 <w:iCs w:val="0"/>
                 <w:smallCaps w:val="0"/>
@@ -1103,7 +1038,6 @@
               <w:ind w:left="0" w:right="0" w:firstLine="0"/>
               <w:jc w:val="left"/>
               <w:rPr>
-                <w:rFonts w:ascii="Calibri" w:cs="Calibri" w:eastAsia="Calibri" w:hAnsi="Calibri"/>
                 <w:b w:val="1"/>
                 <w:bCs w:val="1"/>
                 <w:i w:val="0"/>
@@ -1136,11 +1070,6 @@
               </w:rPr>
               <w:t xml:space="preserve">Para</w:t>
             </w:r>
-            <w:r>
-              <w:rPr>
-                <w:rtl w:val="0"/>
-              </w:rPr>
-            </w:r>
           </w:p>
         </w:tc>
         <w:tc>
@@ -1163,9 +1092,6 @@
               <w:ind w:left="0" w:right="0" w:firstLine="0"/>
               <w:jc w:val="both"/>
               <w:rPr>
-                <w:rFonts w:ascii="Calibri" w:cs="Calibri" w:eastAsia="Calibri" w:hAnsi="Calibri"/>
-                <w:b w:val="0"/>
-                <w:bCs w:val="0"/>
                 <w:i w:val="0"/>
                 <w:iCs w:val="0"/>
                 <w:smallCaps w:val="0"/>
@@ -1218,7 +1144,6 @@
               <w:ind w:left="0" w:right="0" w:firstLine="0"/>
               <w:jc w:val="left"/>
               <w:rPr>
-                <w:rFonts w:ascii="Calibri" w:cs="Calibri" w:eastAsia="Calibri" w:hAnsi="Calibri"/>
                 <w:b w:val="1"/>
                 <w:bCs w:val="1"/>
                 <w:i w:val="0"/>
@@ -1251,11 +1176,6 @@
               </w:rPr>
               <w:t xml:space="preserve">Requerimiento:</w:t>
             </w:r>
-            <w:r>
-              <w:rPr>
-                <w:rtl w:val="0"/>
-              </w:rPr>
-            </w:r>
           </w:p>
         </w:tc>
         <w:tc>
@@ -1270,12 +1190,7 @@
           </w:tcPr>
           <w:p>
             <w:pPr>
-              <w:keepNext w:val="0"/>
-              <w:keepLines w:val="0"/>
-              <w:widowControl w:val="1"/>
-              <w:shd w:fill="auto" w:val="clear"/>
-              <w:spacing w:after="0" w:before="0" w:line="240" w:lineRule="auto"/>
-              <w:ind w:left="0" w:right="0" w:firstLine="0"/>
+              <w:spacing w:after="0" w:line="240" w:lineRule="auto"/>
               <w:jc w:val="both"/>
               <w:rPr/>
             </w:pPr>
@@ -1283,7 +1198,209 @@
               <w:rPr>
                 <w:rtl w:val="0"/>
               </w:rPr>
-              <w:t xml:space="preserve">RF-005</w:t>
+              <w:t xml:space="preserve">- El sistema debe permitir al coordinador registrar un nuevo perfil de desarrollador.</w:t>
+            </w:r>
+          </w:p>
+          <w:p>
+            <w:pPr>
+              <w:spacing w:after="0" w:line="240" w:lineRule="auto"/>
+              <w:jc w:val="both"/>
+              <w:rPr/>
+            </w:pPr>
+            <w:r>
+              <w:rPr>
+                <w:rtl w:val="0"/>
+              </w:rPr>
+              <w:t xml:space="preserve">- El sistema debe permitir consultar perfiles de desarrolladores registrados.</w:t>
+            </w:r>
+          </w:p>
+          <w:p>
+            <w:pPr>
+              <w:spacing w:after="0" w:line="240" w:lineRule="auto"/>
+              <w:jc w:val="both"/>
+              <w:rPr/>
+            </w:pPr>
+            <w:r>
+              <w:rPr>
+                <w:rtl w:val="0"/>
+              </w:rPr>
+              <w:t xml:space="preserve">- El sistema debe permitir modificar la información de un perfil existente.</w:t>
+            </w:r>
+          </w:p>
+          <w:p>
+            <w:pPr>
+              <w:spacing w:after="0" w:line="240" w:lineRule="auto"/>
+              <w:jc w:val="both"/>
+              <w:rPr/>
+            </w:pPr>
+            <w:r>
+              <w:rPr>
+                <w:rtl w:val="0"/>
+              </w:rPr>
+              <w:t xml:space="preserve">- El sistema debe permitir inhabilitar lógicamente un perfil de desarrollador.</w:t>
+            </w:r>
+          </w:p>
+          <w:p>
+            <w:pPr>
+              <w:spacing w:after="0" w:line="240" w:lineRule="auto"/>
+              <w:jc w:val="both"/>
+              <w:rPr/>
+            </w:pPr>
+            <w:r>
+              <w:rPr>
+                <w:rtl w:val="0"/>
+              </w:rPr>
+              <w:t xml:space="preserve">- El sistema debe validar que los campos obligatorios sean diligenciados.</w:t>
+            </w:r>
+          </w:p>
+          <w:p>
+            <w:pPr>
+              <w:spacing w:after="0" w:line="240" w:lineRule="auto"/>
+              <w:jc w:val="both"/>
+              <w:rPr/>
+            </w:pPr>
+            <w:r>
+              <w:rPr>
+                <w:rtl w:val="0"/>
+              </w:rPr>
+              <w:t xml:space="preserve">- El sistema debe validar que la identificación del desarrollador sea única.</w:t>
+            </w:r>
+          </w:p>
+          <w:p>
+            <w:pPr>
+              <w:spacing w:after="0" w:line="240" w:lineRule="auto"/>
+              <w:jc w:val="both"/>
+              <w:rPr/>
+            </w:pPr>
+            <w:r>
+              <w:rPr>
+                <w:rtl w:val="0"/>
+              </w:rPr>
+              <w:t xml:space="preserve">- El sistema debe validar que el correo electrónico sea único.</w:t>
+            </w:r>
+          </w:p>
+          <w:p>
+            <w:pPr>
+              <w:spacing w:after="0" w:line="240" w:lineRule="auto"/>
+              <w:jc w:val="both"/>
+              <w:rPr/>
+            </w:pPr>
+            <w:r>
+              <w:rPr>
+                <w:rtl w:val="0"/>
+              </w:rPr>
+              <w:t xml:space="preserve">- El sistema debe permitir asociar una especialidad al desarrollador.</w:t>
+            </w:r>
+          </w:p>
+          <w:p>
+            <w:pPr>
+              <w:spacing w:after="0" w:line="240" w:lineRule="auto"/>
+              <w:jc w:val="both"/>
+              <w:rPr/>
+            </w:pPr>
+            <w:r>
+              <w:rPr>
+                <w:rtl w:val="0"/>
+              </w:rPr>
+              <w:t xml:space="preserve">- El sistema debe permitir asociar un proyecto cuando corresponda.</w:t>
+            </w:r>
+          </w:p>
+          <w:p>
+            <w:pPr>
+              <w:spacing w:after="0" w:line="240" w:lineRule="auto"/>
+              <w:jc w:val="both"/>
+              <w:rPr/>
+            </w:pPr>
+            <w:r>
+              <w:rPr>
+                <w:rtl w:val="0"/>
+              </w:rPr>
+              <w:t xml:space="preserve">- El sistema debe permitir cargar una fotografía de perfil en un formato válido.</w:t>
+            </w:r>
+          </w:p>
+          <w:p>
+            <w:pPr>
+              <w:spacing w:after="0" w:line="240" w:lineRule="auto"/>
+              <w:jc w:val="both"/>
+              <w:rPr/>
+            </w:pPr>
+            <w:r>
+              <w:rPr>
+                <w:rtl w:val="0"/>
+              </w:rPr>
+              <w:t xml:space="preserve">- El sistema debe registrar el estado del desarrollador (Activo/Inactivo).</w:t>
+            </w:r>
+          </w:p>
+          <w:p>
+            <w:pPr>
+              <w:keepNext w:val="0"/>
+              <w:keepLines w:val="0"/>
+              <w:widowControl w:val="1"/>
+              <w:shd w:fill="auto" w:val="clear"/>
+              <w:spacing w:after="0" w:before="0" w:line="240" w:lineRule="auto"/>
+              <w:ind w:left="0" w:right="0" w:firstLine="0"/>
+              <w:jc w:val="both"/>
+              <w:rPr/>
+            </w:pPr>
+            <w:r>
+              <w:rPr>
+                <w:rtl w:val="0"/>
+              </w:rPr>
+              <w:t xml:space="preserve">- El sistema debe permitir buscar desarrolladores por diferentes criterios.</w:t>
+            </w:r>
+          </w:p>
+          <w:p>
+            <w:pPr>
+              <w:keepNext w:val="0"/>
+              <w:keepLines w:val="0"/>
+              <w:widowControl w:val="1"/>
+              <w:shd w:fill="auto" w:val="clear"/>
+              <w:spacing w:after="0" w:before="0" w:line="240" w:lineRule="auto"/>
+              <w:ind w:left="0" w:right="0" w:firstLine="0"/>
+              <w:jc w:val="both"/>
+              <w:rPr/>
+            </w:pPr>
+            <w:r>
+              <w:rPr>
+                <w:rtl w:val="0"/>
+              </w:rPr>
+              <w:t xml:space="preserve">- El sistema debe permitir registrar desarrolladores sin asignarlos inmediatamente a un proyecto.</w:t>
+            </w:r>
+          </w:p>
+          <w:p>
+            <w:pPr>
+              <w:keepNext w:val="0"/>
+              <w:keepLines w:val="0"/>
+              <w:widowControl w:val="1"/>
+              <w:shd w:fill="auto" w:val="clear"/>
+              <w:spacing w:after="0" w:before="0" w:line="240" w:lineRule="auto"/>
+              <w:ind w:left="0" w:right="0" w:firstLine="0"/>
+              <w:jc w:val="both"/>
+              <w:rPr/>
+            </w:pPr>
+            <w:r>
+              <w:rPr>
+                <w:rtl w:val="0"/>
+              </w:rPr>
+              <w:t xml:space="preserve">- El sistema debe permitir consultar los proyectos a los que pertenece un desarrollador.</w:t>
+            </w:r>
+          </w:p>
+          <w:p>
+            <w:pPr>
+              <w:keepNext w:val="0"/>
+              <w:keepLines w:val="0"/>
+              <w:widowControl w:val="1"/>
+              <w:shd w:fill="auto" w:val="clear"/>
+              <w:spacing w:after="0" w:before="0" w:line="240" w:lineRule="auto"/>
+              <w:ind w:left="0" w:right="0" w:firstLine="0"/>
+              <w:jc w:val="both"/>
+              <w:rPr/>
+            </w:pPr>
+            <w:r>
+              <w:rPr>
+                <w:rtl w:val="0"/>
+              </w:rPr>
+              <w:t xml:space="preserve">- El sistema debe mostrar cuando un desarrollador no tenga proyectos asignados.</w:t>
             </w:r>
           </w:p>
         </w:tc>
@@ -1314,7 +1431,6 @@
               <w:ind w:left="0" w:right="0" w:firstLine="0"/>
               <w:jc w:val="center"/>
               <w:rPr>
-                <w:rFonts w:ascii="Calibri" w:cs="Calibri" w:eastAsia="Calibri" w:hAnsi="Calibri"/>
                 <w:b w:val="1"/>
                 <w:bCs w:val="1"/>
                 <w:i w:val="0"/>
@@ -1346,11 +1462,6 @@
                 <w:rtl w:val="0"/>
               </w:rPr>
               <w:t xml:space="preserve">CRITERIOS DE ACEPTACIÓN</w:t>
-            </w:r>
-            <w:r>
-              <w:rPr>
-                <w:rtl w:val="0"/>
-              </w:rPr>
             </w:r>
           </w:p>
         </w:tc>
@@ -1383,7 +1494,6 @@
               <w:ind w:left="0" w:right="0" w:firstLine="0"/>
               <w:jc w:val="center"/>
               <w:rPr>
-                <w:rFonts w:ascii="Calibri" w:cs="Calibri" w:eastAsia="Calibri" w:hAnsi="Calibri"/>
                 <w:b w:val="1"/>
                 <w:bCs w:val="1"/>
                 <w:i w:val="0"/>
@@ -1416,11 +1526,6 @@
               </w:rPr>
               <w:t xml:space="preserve">Condición 01</w:t>
             </w:r>
-            <w:r>
-              <w:rPr>
-                <w:rtl w:val="0"/>
-              </w:rPr>
-            </w:r>
           </w:p>
           <w:p>
             <w:pPr>
@@ -1432,7 +1537,6 @@
               <w:ind w:left="0" w:right="0" w:firstLine="0"/>
               <w:jc w:val="center"/>
               <w:rPr>
-                <w:rFonts w:ascii="Calibri" w:cs="Calibri" w:eastAsia="Calibri" w:hAnsi="Calibri"/>
                 <w:b w:val="1"/>
                 <w:bCs w:val="1"/>
                 <w:i w:val="0"/>
@@ -1463,7 +1567,6 @@
               <w:ind w:left="0" w:right="0" w:firstLine="0"/>
               <w:jc w:val="center"/>
               <w:rPr>
-                <w:rFonts w:ascii="Calibri" w:cs="Calibri" w:eastAsia="Calibri" w:hAnsi="Calibri"/>
                 <w:b w:val="1"/>
                 <w:bCs w:val="1"/>
                 <w:i w:val="0"/>
@@ -1506,9 +1609,6 @@
               <w:ind w:left="0" w:right="0" w:firstLine="0"/>
               <w:jc w:val="left"/>
               <w:rPr>
-                <w:rFonts w:ascii="Calibri" w:cs="Calibri" w:eastAsia="Calibri" w:hAnsi="Calibri"/>
-                <w:b w:val="0"/>
-                <w:bCs w:val="0"/>
                 <w:i w:val="0"/>
                 <w:iCs w:val="0"/>
                 <w:smallCaps w:val="0"/>
@@ -1567,9 +1667,6 @@
               <w:ind w:left="0" w:right="0" w:firstLine="0"/>
               <w:jc w:val="left"/>
               <w:rPr>
-                <w:rFonts w:ascii="Calibri" w:cs="Calibri" w:eastAsia="Calibri" w:hAnsi="Calibri"/>
-                <w:b w:val="0"/>
-                <w:bCs w:val="0"/>
                 <w:i w:val="0"/>
                 <w:iCs w:val="0"/>
                 <w:smallCaps w:val="0"/>
@@ -1632,9 +1729,6 @@
               <w:ind w:left="0" w:right="0" w:firstLine="0"/>
               <w:jc w:val="left"/>
               <w:rPr>
-                <w:rFonts w:ascii="Calibri" w:cs="Calibri" w:eastAsia="Calibri" w:hAnsi="Calibri"/>
-                <w:b w:val="0"/>
-                <w:bCs w:val="0"/>
                 <w:i w:val="0"/>
                 <w:iCs w:val="0"/>
                 <w:smallCaps w:val="0"/>
@@ -1675,7 +1769,6 @@
               <w:ind w:left="0" w:right="0" w:firstLine="0"/>
               <w:jc w:val="left"/>
               <w:rPr>
-                <w:rFonts w:ascii="Calibri" w:cs="Calibri" w:eastAsia="Calibri" w:hAnsi="Calibri"/>
                 <w:b w:val="1"/>
                 <w:bCs w:val="1"/>
                 <w:i w:val="0"/>
@@ -1707,11 +1800,6 @@
                 <w:rtl w:val="0"/>
               </w:rPr>
               <w:t xml:space="preserve">Cuando:</w:t>
-            </w:r>
-            <w:r>
-              <w:rPr>
-                <w:rtl w:val="0"/>
-              </w:rPr>
             </w:r>
           </w:p>
         </w:tc>
@@ -1811,7 +1899,6 @@
               <w:ind w:left="0" w:right="0" w:firstLine="0"/>
               <w:jc w:val="left"/>
               <w:rPr>
-                <w:rFonts w:ascii="Calibri" w:cs="Calibri" w:eastAsia="Calibri" w:hAnsi="Calibri"/>
                 <w:b w:val="1"/>
                 <w:bCs w:val="1"/>
                 <w:i w:val="0"/>
@@ -1844,11 +1931,6 @@
               </w:rPr>
               <w:t xml:space="preserve">Entonces:</w:t>
             </w:r>
-            <w:r>
-              <w:rPr>
-                <w:rtl w:val="0"/>
-              </w:rPr>
-            </w:r>
           </w:p>
         </w:tc>
         <w:tc>
@@ -1872,9 +1954,6 @@
               <w:ind w:left="0" w:right="0" w:firstLine="0"/>
               <w:jc w:val="left"/>
               <w:rPr>
-                <w:rFonts w:ascii="Calibri" w:cs="Calibri" w:eastAsia="Calibri" w:hAnsi="Calibri"/>
-                <w:b w:val="0"/>
-                <w:bCs w:val="0"/>
                 <w:i w:val="0"/>
                 <w:iCs w:val="0"/>
                 <w:smallCaps w:val="0"/>
@@ -2233,7 +2312,6 @@
               <w:ind w:left="0" w:right="0" w:firstLine="0"/>
               <w:jc w:val="center"/>
               <w:rPr>
-                <w:rFonts w:ascii="Calibri" w:cs="Calibri" w:eastAsia="Calibri" w:hAnsi="Calibri"/>
                 <w:b w:val="1"/>
                 <w:bCs w:val="1"/>
                 <w:i w:val="0"/>
@@ -2291,7 +2369,6 @@
               <w:ind w:left="0" w:right="0" w:firstLine="0"/>
               <w:jc w:val="center"/>
               <w:rPr>
-                <w:rFonts w:ascii="Calibri" w:cs="Calibri" w:eastAsia="Calibri" w:hAnsi="Calibri"/>
                 <w:b w:val="1"/>
                 <w:bCs w:val="1"/>
                 <w:i w:val="0"/>
@@ -2334,7 +2411,6 @@
               <w:ind w:left="0" w:right="0" w:firstLine="0"/>
               <w:jc w:val="left"/>
               <w:rPr>
-                <w:rFonts w:ascii="Calibri" w:cs="Calibri" w:eastAsia="Calibri" w:hAnsi="Calibri"/>
                 <w:b w:val="1"/>
                 <w:bCs w:val="1"/>
                 <w:i w:val="0"/>
@@ -2366,11 +2442,6 @@
                 <w:rtl w:val="0"/>
               </w:rPr>
               <w:t xml:space="preserve">Dado:</w:t>
-            </w:r>
-            <w:r>
-              <w:rPr>
-                <w:rtl w:val="0"/>
-              </w:rPr>
             </w:r>
           </w:p>
         </w:tc>
@@ -2497,7 +2568,6 @@
               <w:ind w:left="0" w:right="0" w:firstLine="0"/>
               <w:jc w:val="left"/>
               <w:rPr>
-                <w:rFonts w:ascii="Calibri" w:cs="Calibri" w:eastAsia="Calibri" w:hAnsi="Calibri"/>
                 <w:b w:val="1"/>
                 <w:bCs w:val="1"/>
                 <w:i w:val="0"/>
@@ -2529,11 +2599,6 @@
                 <w:rtl w:val="0"/>
               </w:rPr>
               <w:t xml:space="preserve">Cuando:</w:t>
-            </w:r>
-            <w:r>
-              <w:rPr>
-                <w:rtl w:val="0"/>
-              </w:rPr>
             </w:r>
           </w:p>
         </w:tc>
@@ -2660,7 +2725,6 @@
               <w:ind w:left="0" w:right="0" w:firstLine="0"/>
               <w:jc w:val="left"/>
               <w:rPr>
-                <w:rFonts w:ascii="Calibri" w:cs="Calibri" w:eastAsia="Calibri" w:hAnsi="Calibri"/>
                 <w:b w:val="1"/>
                 <w:bCs w:val="1"/>
                 <w:i w:val="0"/>
@@ -2692,11 +2756,6 @@
                 <w:rtl w:val="0"/>
               </w:rPr>
               <w:t xml:space="preserve">Entonces:</w:t>
-            </w:r>
-            <w:r>
-              <w:rPr>
-                <w:rtl w:val="0"/>
-              </w:rPr>
             </w:r>
           </w:p>
         </w:tc>
@@ -2775,7 +2834,6 @@
               <w:ind w:left="0" w:right="0" w:firstLine="0"/>
               <w:jc w:val="center"/>
               <w:rPr>
-                <w:rFonts w:ascii="Calibri" w:cs="Calibri" w:eastAsia="Calibri" w:hAnsi="Calibri"/>
                 <w:b w:val="1"/>
                 <w:bCs w:val="1"/>
                 <w:i w:val="0"/>
@@ -2833,7 +2891,6 @@
               <w:ind w:left="0" w:right="0" w:firstLine="0"/>
               <w:jc w:val="center"/>
               <w:rPr>
-                <w:rFonts w:ascii="Calibri" w:cs="Calibri" w:eastAsia="Calibri" w:hAnsi="Calibri"/>
                 <w:b w:val="1"/>
                 <w:bCs w:val="1"/>
                 <w:i w:val="0"/>
@@ -2876,7 +2933,6 @@
               <w:ind w:left="0" w:right="0" w:firstLine="0"/>
               <w:jc w:val="left"/>
               <w:rPr>
-                <w:rFonts w:ascii="Calibri" w:cs="Calibri" w:eastAsia="Calibri" w:hAnsi="Calibri"/>
                 <w:b w:val="1"/>
                 <w:bCs w:val="1"/>
                 <w:i w:val="0"/>
@@ -2908,11 +2964,6 @@
                 <w:rtl w:val="0"/>
               </w:rPr>
               <w:t xml:space="preserve">Dado:</w:t>
-            </w:r>
-            <w:r>
-              <w:rPr>
-                <w:rtl w:val="0"/>
-              </w:rPr>
             </w:r>
           </w:p>
         </w:tc>
@@ -3039,7 +3090,6 @@
               <w:ind w:left="0" w:right="0" w:firstLine="0"/>
               <w:jc w:val="left"/>
               <w:rPr>
-                <w:rFonts w:ascii="Calibri" w:cs="Calibri" w:eastAsia="Calibri" w:hAnsi="Calibri"/>
                 <w:b w:val="1"/>
                 <w:bCs w:val="1"/>
                 <w:i w:val="0"/>
@@ -3071,11 +3121,6 @@
                 <w:rtl w:val="0"/>
               </w:rPr>
               <w:t xml:space="preserve">Cuando:</w:t>
-            </w:r>
-            <w:r>
-              <w:rPr>
-                <w:rtl w:val="0"/>
-              </w:rPr>
             </w:r>
           </w:p>
         </w:tc>
@@ -3202,7 +3247,6 @@
               <w:ind w:left="0" w:right="0" w:firstLine="0"/>
               <w:jc w:val="left"/>
               <w:rPr>
-                <w:rFonts w:ascii="Calibri" w:cs="Calibri" w:eastAsia="Calibri" w:hAnsi="Calibri"/>
                 <w:b w:val="1"/>
                 <w:bCs w:val="1"/>
                 <w:i w:val="0"/>
@@ -3234,11 +3278,6 @@
                 <w:rtl w:val="0"/>
               </w:rPr>
               <w:t xml:space="preserve">Entonces:</w:t>
-            </w:r>
-            <w:r>
-              <w:rPr>
-                <w:rtl w:val="0"/>
-              </w:rPr>
             </w:r>
           </w:p>
         </w:tc>
@@ -3297,6 +3336,2065 @@
         </w:trPr>
         <w:tc>
           <w:tcPr>
+            <w:gridSpan w:val="3"/>
+            <w:vMerge w:val="restart"/>
+            <w:tcBorders>
+              <w:top w:color="000000" w:space="0" w:sz="4" w:val="single"/>
+              <w:left w:color="000000" w:space="0" w:sz="4" w:val="single"/>
+              <w:bottom w:color="000000" w:space="0" w:sz="4" w:val="single"/>
+              <w:right w:color="000000" w:space="0" w:sz="4" w:val="single"/>
+            </w:tcBorders>
+            <w:vAlign w:val="center"/>
+          </w:tcPr>
+          <w:p>
+            <w:pPr>
+              <w:jc w:val="center"/>
+              <w:rPr>
+                <w:b w:val="1"/>
+                <w:bCs w:val="1"/>
+                <w:color w:val="1f3864"/>
+              </w:rPr>
+            </w:pPr>
+            <w:r>
+              <w:rPr>
+                <w:b w:val="1"/>
+                <w:bCs w:val="1"/>
+                <w:color w:val="1f3864"/>
+                <w:rtl w:val="0"/>
+              </w:rPr>
+              <w:t xml:space="preserve">Condición 05</w:t>
+            </w:r>
+          </w:p>
+          <w:p>
+            <w:pPr>
+              <w:jc w:val="center"/>
+              <w:rPr>
+                <w:b w:val="1"/>
+                <w:bCs w:val="1"/>
+                <w:color w:val="1f3864"/>
+              </w:rPr>
+            </w:pPr>
+            <w:r>
+              <w:rPr>
+                <w:rtl w:val="0"/>
+              </w:rPr>
+            </w:r>
+          </w:p>
+        </w:tc>
+        <w:tc>
+          <w:tcPr>
+            <w:gridSpan w:val="2"/>
+            <w:tcBorders>
+              <w:top w:color="000000" w:space="0" w:sz="4" w:val="single"/>
+              <w:left w:color="000000" w:space="0" w:sz="4" w:val="single"/>
+              <w:bottom w:color="000000" w:space="0" w:sz="4" w:val="single"/>
+              <w:right w:color="000000" w:space="0" w:sz="4" w:val="single"/>
+            </w:tcBorders>
+            <w:vAlign w:val="center"/>
+          </w:tcPr>
+          <w:p>
+            <w:pPr>
+              <w:rPr>
+                <w:b w:val="1"/>
+                <w:bCs w:val="1"/>
+                <w:color w:val="1f3864"/>
+              </w:rPr>
+            </w:pPr>
+            <w:r>
+              <w:rPr>
+                <w:b w:val="1"/>
+                <w:bCs w:val="1"/>
+                <w:color w:val="1f3864"/>
+                <w:rtl w:val="0"/>
+              </w:rPr>
+              <w:t xml:space="preserve">Dado:</w:t>
+            </w:r>
+          </w:p>
+        </w:tc>
+        <w:tc>
+          <w:tcPr>
+            <w:gridSpan w:val="4"/>
+            <w:tcBorders>
+              <w:top w:color="000000" w:space="0" w:sz="4" w:val="single"/>
+              <w:left w:color="000000" w:space="0" w:sz="4" w:val="single"/>
+              <w:bottom w:color="000000" w:space="0" w:sz="4" w:val="single"/>
+              <w:right w:color="000000" w:space="0" w:sz="4" w:val="single"/>
+            </w:tcBorders>
+            <w:vAlign w:val="center"/>
+          </w:tcPr>
+          <w:p>
+            <w:pPr>
+              <w:spacing w:line="240" w:lineRule="auto"/>
+              <w:rPr/>
+            </w:pPr>
+            <w:r>
+              <w:rPr>
+                <w:rtl w:val="0"/>
+              </w:rPr>
+              <w:t xml:space="preserve">que el coordinador intenta registrar un desarrollador con una identificación ya existente</w:t>
+            </w:r>
+          </w:p>
+        </w:tc>
+      </w:tr>
+      <w:tr>
+        <w:trPr>
+          <w:cantSplit w:val="0"/>
+          <w:trHeight w:val="220" w:hRule="atLeast"/>
+          <w:tblHeader w:val="0"/>
+        </w:trPr>
+        <w:tc>
+          <w:tcPr>
+            <w:gridSpan w:val="3"/>
+            <w:vMerge w:val="continue"/>
+            <w:tcBorders>
+              <w:top w:color="000000" w:space="0" w:sz="4" w:val="single"/>
+              <w:left w:color="000000" w:space="0" w:sz="4" w:val="single"/>
+              <w:bottom w:color="000000" w:space="0" w:sz="4" w:val="single"/>
+              <w:right w:color="000000" w:space="0" w:sz="4" w:val="single"/>
+            </w:tcBorders>
+            <w:vAlign w:val="center"/>
+          </w:tcPr>
+          <w:p>
+            <w:pPr>
+              <w:keepNext w:val="0"/>
+              <w:keepLines w:val="0"/>
+              <w:pageBreakBefore w:val="0"/>
+              <w:widowControl w:val="0"/>
+              <w:pBdr>
+                <w:top w:space="0" w:sz="0" w:val="nil"/>
+                <w:left w:space="0" w:sz="0" w:val="nil"/>
+                <w:bottom w:space="0" w:sz="0" w:val="nil"/>
+                <w:right w:space="0" w:sz="0" w:val="nil"/>
+                <w:between w:space="0" w:sz="0" w:val="nil"/>
+              </w:pBdr>
+              <w:shd w:fill="auto" w:val="clear"/>
+              <w:spacing w:after="0" w:before="0" w:line="276" w:lineRule="auto"/>
+              <w:ind w:left="0" w:right="0" w:firstLine="0"/>
+              <w:jc w:val="left"/>
+              <w:rPr>
+                <w:i w:val="0"/>
+                <w:iCs w:val="0"/>
+                <w:smallCaps w:val="0"/>
+                <w:strike w:val="0"/>
+                <w:color w:val="000000"/>
+                <w:sz w:val="22"/>
+                <w:szCs w:val="22"/>
+                <w:u w:val="none"/>
+                <w:shd w:fill="auto" w:val="clear"/>
+                <w:vertAlign w:val="baseline"/>
+              </w:rPr>
+            </w:pPr>
+            <w:r>
+              <w:rPr>
+                <w:rtl w:val="0"/>
+              </w:rPr>
+            </w:r>
+          </w:p>
+        </w:tc>
+        <w:tc>
+          <w:tcPr>
+            <w:gridSpan w:val="2"/>
+            <w:tcBorders>
+              <w:top w:color="000000" w:space="0" w:sz="4" w:val="single"/>
+              <w:left w:color="000000" w:space="0" w:sz="4" w:val="single"/>
+              <w:bottom w:color="000000" w:space="0" w:sz="4" w:val="single"/>
+              <w:right w:color="000000" w:space="0" w:sz="4" w:val="single"/>
+            </w:tcBorders>
+            <w:vAlign w:val="center"/>
+          </w:tcPr>
+          <w:p>
+            <w:pPr>
+              <w:rPr>
+                <w:b w:val="1"/>
+                <w:bCs w:val="1"/>
+                <w:color w:val="1f3864"/>
+              </w:rPr>
+            </w:pPr>
+            <w:r>
+              <w:rPr>
+                <w:b w:val="1"/>
+                <w:bCs w:val="1"/>
+                <w:color w:val="1f3864"/>
+                <w:rtl w:val="0"/>
+              </w:rPr>
+              <w:t xml:space="preserve">Cuando:</w:t>
+            </w:r>
+          </w:p>
+        </w:tc>
+        <w:tc>
+          <w:tcPr>
+            <w:gridSpan w:val="4"/>
+            <w:tcBorders>
+              <w:top w:color="000000" w:space="0" w:sz="4" w:val="single"/>
+              <w:left w:color="000000" w:space="0" w:sz="4" w:val="single"/>
+              <w:bottom w:color="000000" w:space="0" w:sz="4" w:val="single"/>
+              <w:right w:color="000000" w:space="0" w:sz="4" w:val="single"/>
+            </w:tcBorders>
+            <w:vAlign w:val="center"/>
+          </w:tcPr>
+          <w:p>
+            <w:pPr>
+              <w:spacing w:line="240" w:lineRule="auto"/>
+              <w:rPr/>
+            </w:pPr>
+            <w:r>
+              <w:rPr>
+                <w:rtl w:val="0"/>
+              </w:rPr>
+              <w:t xml:space="preserve">guarda el formulario</w:t>
+            </w:r>
+          </w:p>
+        </w:tc>
+      </w:tr>
+      <w:tr>
+        <w:trPr>
+          <w:cantSplit w:val="0"/>
+          <w:trHeight w:val="220" w:hRule="atLeast"/>
+          <w:tblHeader w:val="0"/>
+        </w:trPr>
+        <w:tc>
+          <w:tcPr>
+            <w:gridSpan w:val="3"/>
+            <w:vMerge w:val="continue"/>
+            <w:tcBorders>
+              <w:top w:color="000000" w:space="0" w:sz="4" w:val="single"/>
+              <w:left w:color="000000" w:space="0" w:sz="4" w:val="single"/>
+              <w:bottom w:color="000000" w:space="0" w:sz="4" w:val="single"/>
+              <w:right w:color="000000" w:space="0" w:sz="4" w:val="single"/>
+            </w:tcBorders>
+            <w:vAlign w:val="center"/>
+          </w:tcPr>
+          <w:p>
+            <w:pPr>
+              <w:keepNext w:val="0"/>
+              <w:keepLines w:val="0"/>
+              <w:pageBreakBefore w:val="0"/>
+              <w:widowControl w:val="0"/>
+              <w:pBdr>
+                <w:top w:space="0" w:sz="0" w:val="nil"/>
+                <w:left w:space="0" w:sz="0" w:val="nil"/>
+                <w:bottom w:space="0" w:sz="0" w:val="nil"/>
+                <w:right w:space="0" w:sz="0" w:val="nil"/>
+                <w:between w:space="0" w:sz="0" w:val="nil"/>
+              </w:pBdr>
+              <w:shd w:fill="auto" w:val="clear"/>
+              <w:spacing w:after="0" w:before="0" w:line="276" w:lineRule="auto"/>
+              <w:ind w:left="0" w:right="0" w:firstLine="0"/>
+              <w:jc w:val="left"/>
+              <w:rPr>
+                <w:i w:val="0"/>
+                <w:iCs w:val="0"/>
+                <w:smallCaps w:val="0"/>
+                <w:strike w:val="0"/>
+                <w:color w:val="000000"/>
+                <w:sz w:val="22"/>
+                <w:szCs w:val="22"/>
+                <w:u w:val="none"/>
+                <w:shd w:fill="auto" w:val="clear"/>
+                <w:vertAlign w:val="baseline"/>
+              </w:rPr>
+            </w:pPr>
+            <w:r>
+              <w:rPr>
+                <w:rtl w:val="0"/>
+              </w:rPr>
+            </w:r>
+          </w:p>
+        </w:tc>
+        <w:tc>
+          <w:tcPr>
+            <w:gridSpan w:val="2"/>
+            <w:tcBorders>
+              <w:top w:color="000000" w:space="0" w:sz="4" w:val="single"/>
+              <w:left w:color="000000" w:space="0" w:sz="4" w:val="single"/>
+              <w:bottom w:color="000000" w:space="0" w:sz="4" w:val="single"/>
+              <w:right w:color="000000" w:space="0" w:sz="4" w:val="single"/>
+            </w:tcBorders>
+            <w:vAlign w:val="center"/>
+          </w:tcPr>
+          <w:p>
+            <w:pPr>
+              <w:rPr>
+                <w:b w:val="1"/>
+                <w:bCs w:val="1"/>
+                <w:color w:val="1f3864"/>
+              </w:rPr>
+            </w:pPr>
+            <w:r>
+              <w:rPr>
+                <w:b w:val="1"/>
+                <w:bCs w:val="1"/>
+                <w:color w:val="1f3864"/>
+                <w:rtl w:val="0"/>
+              </w:rPr>
+              <w:t xml:space="preserve">Entonces:</w:t>
+            </w:r>
+          </w:p>
+        </w:tc>
+        <w:tc>
+          <w:tcPr>
+            <w:gridSpan w:val="4"/>
+            <w:tcBorders>
+              <w:top w:color="000000" w:space="0" w:sz="4" w:val="single"/>
+              <w:left w:color="000000" w:space="0" w:sz="4" w:val="single"/>
+              <w:bottom w:color="000000" w:space="0" w:sz="4" w:val="single"/>
+              <w:right w:color="000000" w:space="0" w:sz="4" w:val="single"/>
+            </w:tcBorders>
+            <w:vAlign w:val="center"/>
+          </w:tcPr>
+          <w:p>
+            <w:pPr>
+              <w:spacing w:line="240" w:lineRule="auto"/>
+              <w:rPr/>
+            </w:pPr>
+            <w:r>
+              <w:rPr>
+                <w:rtl w:val="0"/>
+              </w:rPr>
+              <w:t xml:space="preserve">el sistema informa que la identificación ya se encuentra registrada</w:t>
+            </w:r>
+          </w:p>
+        </w:tc>
+      </w:tr>
+      <w:tr>
+        <w:trPr>
+          <w:cantSplit w:val="0"/>
+          <w:trHeight w:val="220" w:hRule="atLeast"/>
+          <w:tblHeader w:val="0"/>
+        </w:trPr>
+        <w:tc>
+          <w:tcPr>
+            <w:gridSpan w:val="3"/>
+            <w:vMerge w:val="restart"/>
+            <w:tcBorders>
+              <w:top w:color="000000" w:space="0" w:sz="4" w:val="single"/>
+              <w:left w:color="000000" w:space="0" w:sz="4" w:val="single"/>
+              <w:bottom w:color="000000" w:space="0" w:sz="4" w:val="single"/>
+              <w:right w:color="000000" w:space="0" w:sz="4" w:val="single"/>
+            </w:tcBorders>
+            <w:vAlign w:val="center"/>
+          </w:tcPr>
+          <w:p>
+            <w:pPr>
+              <w:jc w:val="center"/>
+              <w:rPr>
+                <w:b w:val="1"/>
+                <w:bCs w:val="1"/>
+                <w:color w:val="1f3864"/>
+              </w:rPr>
+            </w:pPr>
+            <w:r>
+              <w:rPr>
+                <w:b w:val="1"/>
+                <w:bCs w:val="1"/>
+                <w:color w:val="1f3864"/>
+                <w:rtl w:val="0"/>
+              </w:rPr>
+              <w:t xml:space="preserve">Condición 06</w:t>
+            </w:r>
+          </w:p>
+          <w:p>
+            <w:pPr>
+              <w:jc w:val="center"/>
+              <w:rPr>
+                <w:b w:val="1"/>
+                <w:bCs w:val="1"/>
+                <w:color w:val="1f3864"/>
+              </w:rPr>
+            </w:pPr>
+            <w:r>
+              <w:rPr>
+                <w:rtl w:val="0"/>
+              </w:rPr>
+            </w:r>
+          </w:p>
+        </w:tc>
+        <w:tc>
+          <w:tcPr>
+            <w:gridSpan w:val="2"/>
+            <w:tcBorders>
+              <w:top w:color="000000" w:space="0" w:sz="4" w:val="single"/>
+              <w:left w:color="000000" w:space="0" w:sz="4" w:val="single"/>
+              <w:bottom w:color="000000" w:space="0" w:sz="4" w:val="single"/>
+              <w:right w:color="000000" w:space="0" w:sz="4" w:val="single"/>
+            </w:tcBorders>
+            <w:vAlign w:val="center"/>
+          </w:tcPr>
+          <w:p>
+            <w:pPr>
+              <w:rPr>
+                <w:b w:val="1"/>
+                <w:bCs w:val="1"/>
+                <w:color w:val="1f3864"/>
+              </w:rPr>
+            </w:pPr>
+            <w:r>
+              <w:rPr>
+                <w:b w:val="1"/>
+                <w:bCs w:val="1"/>
+                <w:color w:val="1f3864"/>
+                <w:rtl w:val="0"/>
+              </w:rPr>
+              <w:t xml:space="preserve">Dado:</w:t>
+            </w:r>
+          </w:p>
+        </w:tc>
+        <w:tc>
+          <w:tcPr>
+            <w:gridSpan w:val="4"/>
+            <w:tcBorders>
+              <w:top w:color="000000" w:space="0" w:sz="4" w:val="single"/>
+              <w:left w:color="000000" w:space="0" w:sz="4" w:val="single"/>
+              <w:bottom w:color="000000" w:space="0" w:sz="4" w:val="single"/>
+              <w:right w:color="000000" w:space="0" w:sz="4" w:val="single"/>
+            </w:tcBorders>
+            <w:vAlign w:val="center"/>
+          </w:tcPr>
+          <w:p>
+            <w:pPr>
+              <w:spacing w:line="240" w:lineRule="auto"/>
+              <w:rPr/>
+            </w:pPr>
+            <w:r>
+              <w:rPr>
+                <w:rtl w:val="0"/>
+              </w:rPr>
+              <w:t xml:space="preserve">que el coordinador intenta registrar un desarrollador con un correo electrónico ya registrado</w:t>
+            </w:r>
+          </w:p>
+        </w:tc>
+      </w:tr>
+      <w:tr>
+        <w:trPr>
+          <w:cantSplit w:val="0"/>
+          <w:trHeight w:val="220" w:hRule="atLeast"/>
+          <w:tblHeader w:val="0"/>
+        </w:trPr>
+        <w:tc>
+          <w:tcPr>
+            <w:gridSpan w:val="3"/>
+            <w:vMerge w:val="continue"/>
+            <w:tcBorders>
+              <w:top w:color="000000" w:space="0" w:sz="4" w:val="single"/>
+              <w:left w:color="000000" w:space="0" w:sz="4" w:val="single"/>
+              <w:bottom w:color="000000" w:space="0" w:sz="4" w:val="single"/>
+              <w:right w:color="000000" w:space="0" w:sz="4" w:val="single"/>
+            </w:tcBorders>
+            <w:vAlign w:val="center"/>
+          </w:tcPr>
+          <w:p>
+            <w:pPr>
+              <w:keepNext w:val="0"/>
+              <w:keepLines w:val="0"/>
+              <w:pageBreakBefore w:val="0"/>
+              <w:widowControl w:val="0"/>
+              <w:pBdr>
+                <w:top w:space="0" w:sz="0" w:val="nil"/>
+                <w:left w:space="0" w:sz="0" w:val="nil"/>
+                <w:bottom w:space="0" w:sz="0" w:val="nil"/>
+                <w:right w:space="0" w:sz="0" w:val="nil"/>
+                <w:between w:space="0" w:sz="0" w:val="nil"/>
+              </w:pBdr>
+              <w:shd w:fill="auto" w:val="clear"/>
+              <w:spacing w:after="0" w:before="0" w:line="276" w:lineRule="auto"/>
+              <w:ind w:left="0" w:right="0" w:firstLine="0"/>
+              <w:jc w:val="left"/>
+              <w:rPr>
+                <w:i w:val="0"/>
+                <w:iCs w:val="0"/>
+                <w:smallCaps w:val="0"/>
+                <w:strike w:val="0"/>
+                <w:color w:val="000000"/>
+                <w:sz w:val="22"/>
+                <w:szCs w:val="22"/>
+                <w:u w:val="none"/>
+                <w:shd w:fill="auto" w:val="clear"/>
+                <w:vertAlign w:val="baseline"/>
+              </w:rPr>
+            </w:pPr>
+            <w:r>
+              <w:rPr>
+                <w:rtl w:val="0"/>
+              </w:rPr>
+            </w:r>
+          </w:p>
+        </w:tc>
+        <w:tc>
+          <w:tcPr>
+            <w:gridSpan w:val="2"/>
+            <w:tcBorders>
+              <w:top w:color="000000" w:space="0" w:sz="4" w:val="single"/>
+              <w:left w:color="000000" w:space="0" w:sz="4" w:val="single"/>
+              <w:bottom w:color="000000" w:space="0" w:sz="4" w:val="single"/>
+              <w:right w:color="000000" w:space="0" w:sz="4" w:val="single"/>
+            </w:tcBorders>
+            <w:vAlign w:val="center"/>
+          </w:tcPr>
+          <w:p>
+            <w:pPr>
+              <w:rPr>
+                <w:b w:val="1"/>
+                <w:bCs w:val="1"/>
+                <w:color w:val="1f3864"/>
+              </w:rPr>
+            </w:pPr>
+            <w:r>
+              <w:rPr>
+                <w:b w:val="1"/>
+                <w:bCs w:val="1"/>
+                <w:color w:val="1f3864"/>
+                <w:rtl w:val="0"/>
+              </w:rPr>
+              <w:t xml:space="preserve">Cuando:</w:t>
+            </w:r>
+          </w:p>
+        </w:tc>
+        <w:tc>
+          <w:tcPr>
+            <w:gridSpan w:val="4"/>
+            <w:tcBorders>
+              <w:top w:color="000000" w:space="0" w:sz="4" w:val="single"/>
+              <w:left w:color="000000" w:space="0" w:sz="4" w:val="single"/>
+              <w:bottom w:color="000000" w:space="0" w:sz="4" w:val="single"/>
+              <w:right w:color="000000" w:space="0" w:sz="4" w:val="single"/>
+            </w:tcBorders>
+            <w:vAlign w:val="center"/>
+          </w:tcPr>
+          <w:p>
+            <w:pPr>
+              <w:spacing w:line="240" w:lineRule="auto"/>
+              <w:rPr/>
+            </w:pPr>
+            <w:r>
+              <w:rPr>
+                <w:rtl w:val="0"/>
+              </w:rPr>
+              <w:t xml:space="preserve">guarda el formulario</w:t>
+            </w:r>
+          </w:p>
+        </w:tc>
+      </w:tr>
+      <w:tr>
+        <w:trPr>
+          <w:cantSplit w:val="0"/>
+          <w:trHeight w:val="220" w:hRule="atLeast"/>
+          <w:tblHeader w:val="0"/>
+        </w:trPr>
+        <w:tc>
+          <w:tcPr>
+            <w:gridSpan w:val="3"/>
+            <w:vMerge w:val="continue"/>
+            <w:tcBorders>
+              <w:top w:color="000000" w:space="0" w:sz="4" w:val="single"/>
+              <w:left w:color="000000" w:space="0" w:sz="4" w:val="single"/>
+              <w:bottom w:color="000000" w:space="0" w:sz="4" w:val="single"/>
+              <w:right w:color="000000" w:space="0" w:sz="4" w:val="single"/>
+            </w:tcBorders>
+            <w:vAlign w:val="center"/>
+          </w:tcPr>
+          <w:p>
+            <w:pPr>
+              <w:keepNext w:val="0"/>
+              <w:keepLines w:val="0"/>
+              <w:pageBreakBefore w:val="0"/>
+              <w:widowControl w:val="0"/>
+              <w:pBdr>
+                <w:top w:space="0" w:sz="0" w:val="nil"/>
+                <w:left w:space="0" w:sz="0" w:val="nil"/>
+                <w:bottom w:space="0" w:sz="0" w:val="nil"/>
+                <w:right w:space="0" w:sz="0" w:val="nil"/>
+                <w:between w:space="0" w:sz="0" w:val="nil"/>
+              </w:pBdr>
+              <w:shd w:fill="auto" w:val="clear"/>
+              <w:spacing w:after="0" w:before="0" w:line="276" w:lineRule="auto"/>
+              <w:ind w:left="0" w:right="0" w:firstLine="0"/>
+              <w:jc w:val="left"/>
+              <w:rPr>
+                <w:i w:val="0"/>
+                <w:iCs w:val="0"/>
+                <w:smallCaps w:val="0"/>
+                <w:strike w:val="0"/>
+                <w:color w:val="000000"/>
+                <w:sz w:val="22"/>
+                <w:szCs w:val="22"/>
+                <w:u w:val="none"/>
+                <w:shd w:fill="auto" w:val="clear"/>
+                <w:vertAlign w:val="baseline"/>
+              </w:rPr>
+            </w:pPr>
+            <w:r>
+              <w:rPr>
+                <w:rtl w:val="0"/>
+              </w:rPr>
+            </w:r>
+          </w:p>
+        </w:tc>
+        <w:tc>
+          <w:tcPr>
+            <w:gridSpan w:val="2"/>
+            <w:tcBorders>
+              <w:top w:color="000000" w:space="0" w:sz="4" w:val="single"/>
+              <w:left w:color="000000" w:space="0" w:sz="4" w:val="single"/>
+              <w:bottom w:color="000000" w:space="0" w:sz="4" w:val="single"/>
+              <w:right w:color="000000" w:space="0" w:sz="4" w:val="single"/>
+            </w:tcBorders>
+            <w:vAlign w:val="center"/>
+          </w:tcPr>
+          <w:p>
+            <w:pPr>
+              <w:rPr>
+                <w:b w:val="1"/>
+                <w:bCs w:val="1"/>
+                <w:color w:val="1f3864"/>
+              </w:rPr>
+            </w:pPr>
+            <w:r>
+              <w:rPr>
+                <w:b w:val="1"/>
+                <w:bCs w:val="1"/>
+                <w:color w:val="1f3864"/>
+                <w:rtl w:val="0"/>
+              </w:rPr>
+              <w:t xml:space="preserve">Entonces:</w:t>
+            </w:r>
+          </w:p>
+        </w:tc>
+        <w:tc>
+          <w:tcPr>
+            <w:gridSpan w:val="4"/>
+            <w:tcBorders>
+              <w:top w:color="000000" w:space="0" w:sz="4" w:val="single"/>
+              <w:left w:color="000000" w:space="0" w:sz="4" w:val="single"/>
+              <w:bottom w:color="000000" w:space="0" w:sz="4" w:val="single"/>
+              <w:right w:color="000000" w:space="0" w:sz="4" w:val="single"/>
+            </w:tcBorders>
+            <w:vAlign w:val="center"/>
+          </w:tcPr>
+          <w:p>
+            <w:pPr>
+              <w:spacing w:line="240" w:lineRule="auto"/>
+              <w:rPr/>
+            </w:pPr>
+            <w:r>
+              <w:rPr>
+                <w:rtl w:val="0"/>
+              </w:rPr>
+              <w:t xml:space="preserve">el sistema informa que el correo electrónico ya se encuentra registrado</w:t>
+            </w:r>
+          </w:p>
+        </w:tc>
+      </w:tr>
+      <w:tr>
+        <w:trPr>
+          <w:cantSplit w:val="0"/>
+          <w:trHeight w:val="220" w:hRule="atLeast"/>
+          <w:tblHeader w:val="0"/>
+        </w:trPr>
+        <w:tc>
+          <w:tcPr>
+            <w:gridSpan w:val="3"/>
+            <w:vMerge w:val="restart"/>
+            <w:tcBorders>
+              <w:top w:color="000000" w:space="0" w:sz="4" w:val="single"/>
+              <w:left w:color="000000" w:space="0" w:sz="4" w:val="single"/>
+              <w:bottom w:color="000000" w:space="0" w:sz="4" w:val="single"/>
+              <w:right w:color="000000" w:space="0" w:sz="4" w:val="single"/>
+            </w:tcBorders>
+            <w:vAlign w:val="center"/>
+          </w:tcPr>
+          <w:p>
+            <w:pPr>
+              <w:jc w:val="center"/>
+              <w:rPr>
+                <w:b w:val="1"/>
+                <w:bCs w:val="1"/>
+                <w:color w:val="1f3864"/>
+              </w:rPr>
+            </w:pPr>
+            <w:r>
+              <w:rPr>
+                <w:b w:val="1"/>
+                <w:bCs w:val="1"/>
+                <w:color w:val="1f3864"/>
+                <w:rtl w:val="0"/>
+              </w:rPr>
+              <w:t xml:space="preserve">Condición 07</w:t>
+            </w:r>
+          </w:p>
+          <w:p>
+            <w:pPr>
+              <w:jc w:val="center"/>
+              <w:rPr>
+                <w:b w:val="1"/>
+                <w:bCs w:val="1"/>
+                <w:color w:val="1f3864"/>
+              </w:rPr>
+            </w:pPr>
+            <w:r>
+              <w:rPr>
+                <w:rtl w:val="0"/>
+              </w:rPr>
+            </w:r>
+          </w:p>
+        </w:tc>
+        <w:tc>
+          <w:tcPr>
+            <w:gridSpan w:val="2"/>
+            <w:tcBorders>
+              <w:top w:color="000000" w:space="0" w:sz="4" w:val="single"/>
+              <w:left w:color="000000" w:space="0" w:sz="4" w:val="single"/>
+              <w:bottom w:color="000000" w:space="0" w:sz="4" w:val="single"/>
+              <w:right w:color="000000" w:space="0" w:sz="4" w:val="single"/>
+            </w:tcBorders>
+            <w:vAlign w:val="center"/>
+          </w:tcPr>
+          <w:p>
+            <w:pPr>
+              <w:rPr>
+                <w:b w:val="1"/>
+                <w:bCs w:val="1"/>
+                <w:color w:val="1f3864"/>
+              </w:rPr>
+            </w:pPr>
+            <w:r>
+              <w:rPr>
+                <w:b w:val="1"/>
+                <w:bCs w:val="1"/>
+                <w:color w:val="1f3864"/>
+                <w:rtl w:val="0"/>
+              </w:rPr>
+              <w:t xml:space="preserve">Dado:</w:t>
+            </w:r>
+          </w:p>
+        </w:tc>
+        <w:tc>
+          <w:tcPr>
+            <w:gridSpan w:val="4"/>
+            <w:tcBorders>
+              <w:top w:color="000000" w:space="0" w:sz="4" w:val="single"/>
+              <w:left w:color="000000" w:space="0" w:sz="4" w:val="single"/>
+              <w:bottom w:color="000000" w:space="0" w:sz="4" w:val="single"/>
+              <w:right w:color="000000" w:space="0" w:sz="4" w:val="single"/>
+            </w:tcBorders>
+            <w:vAlign w:val="center"/>
+          </w:tcPr>
+          <w:p>
+            <w:pPr>
+              <w:spacing w:line="240" w:lineRule="auto"/>
+              <w:rPr/>
+            </w:pPr>
+            <w:r>
+              <w:rPr>
+                <w:rtl w:val="0"/>
+              </w:rPr>
+              <w:t xml:space="preserve">que el coordinador busca un desarrollador y no existen coincidencias</w:t>
+            </w:r>
+          </w:p>
+        </w:tc>
+      </w:tr>
+      <w:tr>
+        <w:trPr>
+          <w:cantSplit w:val="0"/>
+          <w:trHeight w:val="220" w:hRule="atLeast"/>
+          <w:tblHeader w:val="0"/>
+        </w:trPr>
+        <w:tc>
+          <w:tcPr>
+            <w:gridSpan w:val="3"/>
+            <w:vMerge w:val="continue"/>
+            <w:tcBorders>
+              <w:top w:color="000000" w:space="0" w:sz="4" w:val="single"/>
+              <w:left w:color="000000" w:space="0" w:sz="4" w:val="single"/>
+              <w:bottom w:color="000000" w:space="0" w:sz="4" w:val="single"/>
+              <w:right w:color="000000" w:space="0" w:sz="4" w:val="single"/>
+            </w:tcBorders>
+            <w:vAlign w:val="center"/>
+          </w:tcPr>
+          <w:p>
+            <w:pPr>
+              <w:keepNext w:val="0"/>
+              <w:keepLines w:val="0"/>
+              <w:pageBreakBefore w:val="0"/>
+              <w:widowControl w:val="0"/>
+              <w:pBdr>
+                <w:top w:space="0" w:sz="0" w:val="nil"/>
+                <w:left w:space="0" w:sz="0" w:val="nil"/>
+                <w:bottom w:space="0" w:sz="0" w:val="nil"/>
+                <w:right w:space="0" w:sz="0" w:val="nil"/>
+                <w:between w:space="0" w:sz="0" w:val="nil"/>
+              </w:pBdr>
+              <w:shd w:fill="auto" w:val="clear"/>
+              <w:spacing w:after="0" w:before="0" w:line="276" w:lineRule="auto"/>
+              <w:ind w:left="0" w:right="0" w:firstLine="0"/>
+              <w:jc w:val="left"/>
+              <w:rPr>
+                <w:i w:val="0"/>
+                <w:iCs w:val="0"/>
+                <w:smallCaps w:val="0"/>
+                <w:strike w:val="0"/>
+                <w:color w:val="000000"/>
+                <w:sz w:val="22"/>
+                <w:szCs w:val="22"/>
+                <w:u w:val="none"/>
+                <w:shd w:fill="auto" w:val="clear"/>
+                <w:vertAlign w:val="baseline"/>
+              </w:rPr>
+            </w:pPr>
+            <w:r>
+              <w:rPr>
+                <w:rtl w:val="0"/>
+              </w:rPr>
+            </w:r>
+          </w:p>
+        </w:tc>
+        <w:tc>
+          <w:tcPr>
+            <w:gridSpan w:val="2"/>
+            <w:tcBorders>
+              <w:top w:color="000000" w:space="0" w:sz="4" w:val="single"/>
+              <w:left w:color="000000" w:space="0" w:sz="4" w:val="single"/>
+              <w:bottom w:color="000000" w:space="0" w:sz="4" w:val="single"/>
+              <w:right w:color="000000" w:space="0" w:sz="4" w:val="single"/>
+            </w:tcBorders>
+            <w:vAlign w:val="center"/>
+          </w:tcPr>
+          <w:p>
+            <w:pPr>
+              <w:rPr>
+                <w:b w:val="1"/>
+                <w:bCs w:val="1"/>
+                <w:color w:val="1f3864"/>
+              </w:rPr>
+            </w:pPr>
+            <w:r>
+              <w:rPr>
+                <w:b w:val="1"/>
+                <w:bCs w:val="1"/>
+                <w:color w:val="1f3864"/>
+                <w:rtl w:val="0"/>
+              </w:rPr>
+              <w:t xml:space="preserve">Cuando:</w:t>
+            </w:r>
+          </w:p>
+        </w:tc>
+        <w:tc>
+          <w:tcPr>
+            <w:gridSpan w:val="4"/>
+            <w:tcBorders>
+              <w:top w:color="000000" w:space="0" w:sz="4" w:val="single"/>
+              <w:left w:color="000000" w:space="0" w:sz="4" w:val="single"/>
+              <w:bottom w:color="000000" w:space="0" w:sz="4" w:val="single"/>
+              <w:right w:color="000000" w:space="0" w:sz="4" w:val="single"/>
+            </w:tcBorders>
+            <w:vAlign w:val="center"/>
+          </w:tcPr>
+          <w:p>
+            <w:pPr>
+              <w:spacing w:line="240" w:lineRule="auto"/>
+              <w:rPr/>
+            </w:pPr>
+            <w:r>
+              <w:rPr>
+                <w:rtl w:val="0"/>
+              </w:rPr>
+              <w:t xml:space="preserve">ejecuta la búsqueda</w:t>
+            </w:r>
+          </w:p>
+        </w:tc>
+      </w:tr>
+      <w:tr>
+        <w:trPr>
+          <w:cantSplit w:val="0"/>
+          <w:trHeight w:val="220" w:hRule="atLeast"/>
+          <w:tblHeader w:val="0"/>
+        </w:trPr>
+        <w:tc>
+          <w:tcPr>
+            <w:gridSpan w:val="3"/>
+            <w:vMerge w:val="continue"/>
+            <w:tcBorders>
+              <w:top w:color="000000" w:space="0" w:sz="4" w:val="single"/>
+              <w:left w:color="000000" w:space="0" w:sz="4" w:val="single"/>
+              <w:bottom w:color="000000" w:space="0" w:sz="4" w:val="single"/>
+              <w:right w:color="000000" w:space="0" w:sz="4" w:val="single"/>
+            </w:tcBorders>
+            <w:vAlign w:val="center"/>
+          </w:tcPr>
+          <w:p>
+            <w:pPr>
+              <w:keepNext w:val="0"/>
+              <w:keepLines w:val="0"/>
+              <w:pageBreakBefore w:val="0"/>
+              <w:widowControl w:val="0"/>
+              <w:pBdr>
+                <w:top w:space="0" w:sz="0" w:val="nil"/>
+                <w:left w:space="0" w:sz="0" w:val="nil"/>
+                <w:bottom w:space="0" w:sz="0" w:val="nil"/>
+                <w:right w:space="0" w:sz="0" w:val="nil"/>
+                <w:between w:space="0" w:sz="0" w:val="nil"/>
+              </w:pBdr>
+              <w:shd w:fill="auto" w:val="clear"/>
+              <w:spacing w:after="0" w:before="0" w:line="276" w:lineRule="auto"/>
+              <w:ind w:left="0" w:right="0" w:firstLine="0"/>
+              <w:jc w:val="left"/>
+              <w:rPr>
+                <w:i w:val="0"/>
+                <w:iCs w:val="0"/>
+                <w:smallCaps w:val="0"/>
+                <w:strike w:val="0"/>
+                <w:color w:val="000000"/>
+                <w:sz w:val="22"/>
+                <w:szCs w:val="22"/>
+                <w:u w:val="none"/>
+                <w:shd w:fill="auto" w:val="clear"/>
+                <w:vertAlign w:val="baseline"/>
+              </w:rPr>
+            </w:pPr>
+            <w:r>
+              <w:rPr>
+                <w:rtl w:val="0"/>
+              </w:rPr>
+            </w:r>
+          </w:p>
+        </w:tc>
+        <w:tc>
+          <w:tcPr>
+            <w:gridSpan w:val="2"/>
+            <w:tcBorders>
+              <w:top w:color="000000" w:space="0" w:sz="4" w:val="single"/>
+              <w:left w:color="000000" w:space="0" w:sz="4" w:val="single"/>
+              <w:bottom w:color="000000" w:space="0" w:sz="4" w:val="single"/>
+              <w:right w:color="000000" w:space="0" w:sz="4" w:val="single"/>
+            </w:tcBorders>
+            <w:vAlign w:val="center"/>
+          </w:tcPr>
+          <w:p>
+            <w:pPr>
+              <w:rPr>
+                <w:b w:val="1"/>
+                <w:bCs w:val="1"/>
+                <w:color w:val="1f3864"/>
+              </w:rPr>
+            </w:pPr>
+            <w:r>
+              <w:rPr>
+                <w:b w:val="1"/>
+                <w:bCs w:val="1"/>
+                <w:color w:val="1f3864"/>
+                <w:rtl w:val="0"/>
+              </w:rPr>
+              <w:t xml:space="preserve">Entonces:</w:t>
+            </w:r>
+          </w:p>
+        </w:tc>
+        <w:tc>
+          <w:tcPr>
+            <w:gridSpan w:val="4"/>
+            <w:tcBorders>
+              <w:top w:color="000000" w:space="0" w:sz="4" w:val="single"/>
+              <w:left w:color="000000" w:space="0" w:sz="4" w:val="single"/>
+              <w:bottom w:color="000000" w:space="0" w:sz="4" w:val="single"/>
+              <w:right w:color="000000" w:space="0" w:sz="4" w:val="single"/>
+            </w:tcBorders>
+            <w:vAlign w:val="center"/>
+          </w:tcPr>
+          <w:p>
+            <w:pPr>
+              <w:keepNext w:val="0"/>
+              <w:keepLines w:val="0"/>
+              <w:widowControl w:val="1"/>
+              <w:pBdr>
+                <w:top w:space="0" w:sz="0" w:val="nil"/>
+                <w:left w:space="0" w:sz="0" w:val="nil"/>
+                <w:bottom w:space="0" w:sz="0" w:val="nil"/>
+                <w:right w:space="0" w:sz="0" w:val="nil"/>
+                <w:between w:space="0" w:sz="0" w:val="nil"/>
+              </w:pBdr>
+              <w:shd w:fill="auto" w:val="clear"/>
+              <w:spacing w:after="160" w:before="0" w:line="240" w:lineRule="auto"/>
+              <w:ind w:left="0" w:right="0" w:firstLine="0"/>
+              <w:jc w:val="left"/>
+              <w:rPr/>
+            </w:pPr>
+            <w:r>
+              <w:rPr>
+                <w:rtl w:val="0"/>
+              </w:rPr>
+              <w:t xml:space="preserve">el sistema informa que no se encontraron resultados.</w:t>
+            </w:r>
+          </w:p>
+        </w:tc>
+      </w:tr>
+      <w:tr>
+        <w:trPr>
+          <w:cantSplit w:val="0"/>
+          <w:trHeight w:val="220" w:hRule="atLeast"/>
+          <w:tblHeader w:val="0"/>
+        </w:trPr>
+        <w:tc>
+          <w:tcPr>
+            <w:gridSpan w:val="3"/>
+            <w:vMerge w:val="restart"/>
+            <w:tcBorders>
+              <w:top w:color="000000" w:space="0" w:sz="4" w:val="single"/>
+              <w:left w:color="000000" w:space="0" w:sz="4" w:val="single"/>
+              <w:bottom w:color="000000" w:space="0" w:sz="4" w:val="single"/>
+              <w:right w:color="000000" w:space="0" w:sz="4" w:val="single"/>
+            </w:tcBorders>
+            <w:vAlign w:val="center"/>
+          </w:tcPr>
+          <w:p>
+            <w:pPr>
+              <w:jc w:val="center"/>
+              <w:rPr>
+                <w:b w:val="1"/>
+                <w:bCs w:val="1"/>
+                <w:color w:val="1f3864"/>
+              </w:rPr>
+            </w:pPr>
+            <w:r>
+              <w:rPr>
+                <w:b w:val="1"/>
+                <w:bCs w:val="1"/>
+                <w:color w:val="1f3864"/>
+                <w:rtl w:val="0"/>
+              </w:rPr>
+              <w:t xml:space="preserve">Condición 08</w:t>
+            </w:r>
+          </w:p>
+          <w:p>
+            <w:pPr>
+              <w:jc w:val="center"/>
+              <w:rPr>
+                <w:b w:val="1"/>
+                <w:bCs w:val="1"/>
+                <w:color w:val="1f3864"/>
+              </w:rPr>
+            </w:pPr>
+            <w:r>
+              <w:rPr>
+                <w:rtl w:val="0"/>
+              </w:rPr>
+            </w:r>
+          </w:p>
+        </w:tc>
+        <w:tc>
+          <w:tcPr>
+            <w:gridSpan w:val="2"/>
+            <w:tcBorders>
+              <w:top w:color="000000" w:space="0" w:sz="4" w:val="single"/>
+              <w:left w:color="000000" w:space="0" w:sz="4" w:val="single"/>
+              <w:bottom w:color="000000" w:space="0" w:sz="4" w:val="single"/>
+              <w:right w:color="000000" w:space="0" w:sz="4" w:val="single"/>
+            </w:tcBorders>
+            <w:vAlign w:val="center"/>
+          </w:tcPr>
+          <w:p>
+            <w:pPr>
+              <w:rPr>
+                <w:b w:val="1"/>
+                <w:bCs w:val="1"/>
+                <w:color w:val="1f3864"/>
+              </w:rPr>
+            </w:pPr>
+            <w:r>
+              <w:rPr>
+                <w:b w:val="1"/>
+                <w:bCs w:val="1"/>
+                <w:color w:val="1f3864"/>
+                <w:rtl w:val="0"/>
+              </w:rPr>
+              <w:t xml:space="preserve">Dado:</w:t>
+            </w:r>
+          </w:p>
+        </w:tc>
+        <w:tc>
+          <w:tcPr>
+            <w:gridSpan w:val="4"/>
+            <w:tcBorders>
+              <w:top w:color="000000" w:space="0" w:sz="4" w:val="single"/>
+              <w:left w:color="000000" w:space="0" w:sz="4" w:val="single"/>
+              <w:bottom w:color="000000" w:space="0" w:sz="4" w:val="single"/>
+              <w:right w:color="000000" w:space="0" w:sz="4" w:val="single"/>
+            </w:tcBorders>
+            <w:vAlign w:val="center"/>
+          </w:tcPr>
+          <w:p>
+            <w:pPr>
+              <w:keepNext w:val="0"/>
+              <w:keepLines w:val="0"/>
+              <w:widowControl w:val="1"/>
+              <w:pBdr>
+                <w:top w:space="0" w:sz="0" w:val="nil"/>
+                <w:left w:space="0" w:sz="0" w:val="nil"/>
+                <w:bottom w:space="0" w:sz="0" w:val="nil"/>
+                <w:right w:space="0" w:sz="0" w:val="nil"/>
+                <w:between w:space="0" w:sz="0" w:val="nil"/>
+              </w:pBdr>
+              <w:shd w:fill="auto" w:val="clear"/>
+              <w:spacing w:after="160" w:before="0" w:line="240" w:lineRule="auto"/>
+              <w:ind w:left="0" w:right="0" w:firstLine="0"/>
+              <w:jc w:val="left"/>
+              <w:rPr/>
+            </w:pPr>
+            <w:r>
+              <w:rPr>
+                <w:rtl w:val="0"/>
+              </w:rPr>
+              <w:t xml:space="preserve">que el coordinador modifica correctamente un perfil existente</w:t>
+            </w:r>
+          </w:p>
+        </w:tc>
+      </w:tr>
+      <w:tr>
+        <w:trPr>
+          <w:cantSplit w:val="0"/>
+          <w:trHeight w:val="220" w:hRule="atLeast"/>
+          <w:tblHeader w:val="0"/>
+        </w:trPr>
+        <w:tc>
+          <w:tcPr>
+            <w:gridSpan w:val="3"/>
+            <w:vMerge w:val="continue"/>
+            <w:tcBorders>
+              <w:top w:color="000000" w:space="0" w:sz="4" w:val="single"/>
+              <w:left w:color="000000" w:space="0" w:sz="4" w:val="single"/>
+              <w:bottom w:color="000000" w:space="0" w:sz="4" w:val="single"/>
+              <w:right w:color="000000" w:space="0" w:sz="4" w:val="single"/>
+            </w:tcBorders>
+            <w:vAlign w:val="center"/>
+          </w:tcPr>
+          <w:p>
+            <w:pPr>
+              <w:keepNext w:val="0"/>
+              <w:keepLines w:val="0"/>
+              <w:pageBreakBefore w:val="0"/>
+              <w:widowControl w:val="0"/>
+              <w:pBdr>
+                <w:top w:space="0" w:sz="0" w:val="nil"/>
+                <w:left w:space="0" w:sz="0" w:val="nil"/>
+                <w:bottom w:space="0" w:sz="0" w:val="nil"/>
+                <w:right w:space="0" w:sz="0" w:val="nil"/>
+                <w:between w:space="0" w:sz="0" w:val="nil"/>
+              </w:pBdr>
+              <w:shd w:fill="auto" w:val="clear"/>
+              <w:spacing w:after="0" w:before="0" w:line="276" w:lineRule="auto"/>
+              <w:ind w:left="0" w:right="0" w:firstLine="0"/>
+              <w:jc w:val="left"/>
+              <w:rPr>
+                <w:i w:val="0"/>
+                <w:iCs w:val="0"/>
+                <w:smallCaps w:val="0"/>
+                <w:strike w:val="0"/>
+                <w:color w:val="000000"/>
+                <w:sz w:val="22"/>
+                <w:szCs w:val="22"/>
+                <w:u w:val="none"/>
+                <w:shd w:fill="auto" w:val="clear"/>
+                <w:vertAlign w:val="baseline"/>
+              </w:rPr>
+            </w:pPr>
+            <w:r>
+              <w:rPr>
+                <w:rtl w:val="0"/>
+              </w:rPr>
+            </w:r>
+          </w:p>
+        </w:tc>
+        <w:tc>
+          <w:tcPr>
+            <w:gridSpan w:val="2"/>
+            <w:tcBorders>
+              <w:top w:color="000000" w:space="0" w:sz="4" w:val="single"/>
+              <w:left w:color="000000" w:space="0" w:sz="4" w:val="single"/>
+              <w:bottom w:color="000000" w:space="0" w:sz="4" w:val="single"/>
+              <w:right w:color="000000" w:space="0" w:sz="4" w:val="single"/>
+            </w:tcBorders>
+            <w:vAlign w:val="center"/>
+          </w:tcPr>
+          <w:p>
+            <w:pPr>
+              <w:rPr>
+                <w:b w:val="1"/>
+                <w:bCs w:val="1"/>
+                <w:color w:val="1f3864"/>
+              </w:rPr>
+            </w:pPr>
+            <w:r>
+              <w:rPr>
+                <w:b w:val="1"/>
+                <w:bCs w:val="1"/>
+                <w:color w:val="1f3864"/>
+                <w:rtl w:val="0"/>
+              </w:rPr>
+              <w:t xml:space="preserve">Cuando:</w:t>
+            </w:r>
+          </w:p>
+        </w:tc>
+        <w:tc>
+          <w:tcPr>
+            <w:gridSpan w:val="4"/>
+            <w:tcBorders>
+              <w:top w:color="000000" w:space="0" w:sz="4" w:val="single"/>
+              <w:left w:color="000000" w:space="0" w:sz="4" w:val="single"/>
+              <w:bottom w:color="000000" w:space="0" w:sz="4" w:val="single"/>
+              <w:right w:color="000000" w:space="0" w:sz="4" w:val="single"/>
+            </w:tcBorders>
+            <w:vAlign w:val="center"/>
+          </w:tcPr>
+          <w:p>
+            <w:pPr>
+              <w:keepNext w:val="0"/>
+              <w:keepLines w:val="0"/>
+              <w:widowControl w:val="1"/>
+              <w:pBdr>
+                <w:top w:space="0" w:sz="0" w:val="nil"/>
+                <w:left w:space="0" w:sz="0" w:val="nil"/>
+                <w:bottom w:space="0" w:sz="0" w:val="nil"/>
+                <w:right w:space="0" w:sz="0" w:val="nil"/>
+                <w:between w:space="0" w:sz="0" w:val="nil"/>
+              </w:pBdr>
+              <w:shd w:fill="auto" w:val="clear"/>
+              <w:spacing w:after="160" w:before="0" w:line="240" w:lineRule="auto"/>
+              <w:ind w:left="0" w:right="0" w:firstLine="0"/>
+              <w:jc w:val="left"/>
+              <w:rPr/>
+            </w:pPr>
+            <w:r>
+              <w:rPr>
+                <w:rtl w:val="0"/>
+              </w:rPr>
+              <w:t xml:space="preserve">guarda los cambios</w:t>
+            </w:r>
+          </w:p>
+        </w:tc>
+      </w:tr>
+      <w:tr>
+        <w:trPr>
+          <w:cantSplit w:val="0"/>
+          <w:trHeight w:val="220" w:hRule="atLeast"/>
+          <w:tblHeader w:val="0"/>
+        </w:trPr>
+        <w:tc>
+          <w:tcPr>
+            <w:gridSpan w:val="3"/>
+            <w:vMerge w:val="continue"/>
+            <w:tcBorders>
+              <w:top w:color="000000" w:space="0" w:sz="4" w:val="single"/>
+              <w:left w:color="000000" w:space="0" w:sz="4" w:val="single"/>
+              <w:bottom w:color="000000" w:space="0" w:sz="4" w:val="single"/>
+              <w:right w:color="000000" w:space="0" w:sz="4" w:val="single"/>
+            </w:tcBorders>
+            <w:vAlign w:val="center"/>
+          </w:tcPr>
+          <w:p>
+            <w:pPr>
+              <w:keepNext w:val="0"/>
+              <w:keepLines w:val="0"/>
+              <w:pageBreakBefore w:val="0"/>
+              <w:widowControl w:val="0"/>
+              <w:pBdr>
+                <w:top w:space="0" w:sz="0" w:val="nil"/>
+                <w:left w:space="0" w:sz="0" w:val="nil"/>
+                <w:bottom w:space="0" w:sz="0" w:val="nil"/>
+                <w:right w:space="0" w:sz="0" w:val="nil"/>
+                <w:between w:space="0" w:sz="0" w:val="nil"/>
+              </w:pBdr>
+              <w:shd w:fill="auto" w:val="clear"/>
+              <w:spacing w:after="0" w:before="0" w:line="276" w:lineRule="auto"/>
+              <w:ind w:left="0" w:right="0" w:firstLine="0"/>
+              <w:jc w:val="left"/>
+              <w:rPr>
+                <w:i w:val="0"/>
+                <w:iCs w:val="0"/>
+                <w:smallCaps w:val="0"/>
+                <w:strike w:val="0"/>
+                <w:color w:val="000000"/>
+                <w:sz w:val="22"/>
+                <w:szCs w:val="22"/>
+                <w:u w:val="none"/>
+                <w:shd w:fill="auto" w:val="clear"/>
+                <w:vertAlign w:val="baseline"/>
+              </w:rPr>
+            </w:pPr>
+            <w:r>
+              <w:rPr>
+                <w:rtl w:val="0"/>
+              </w:rPr>
+            </w:r>
+          </w:p>
+        </w:tc>
+        <w:tc>
+          <w:tcPr>
+            <w:gridSpan w:val="2"/>
+            <w:tcBorders>
+              <w:top w:color="000000" w:space="0" w:sz="4" w:val="single"/>
+              <w:left w:color="000000" w:space="0" w:sz="4" w:val="single"/>
+              <w:bottom w:color="000000" w:space="0" w:sz="4" w:val="single"/>
+              <w:right w:color="000000" w:space="0" w:sz="4" w:val="single"/>
+            </w:tcBorders>
+            <w:vAlign w:val="center"/>
+          </w:tcPr>
+          <w:p>
+            <w:pPr>
+              <w:rPr>
+                <w:b w:val="1"/>
+                <w:bCs w:val="1"/>
+                <w:color w:val="1f3864"/>
+              </w:rPr>
+            </w:pPr>
+            <w:r>
+              <w:rPr>
+                <w:b w:val="1"/>
+                <w:bCs w:val="1"/>
+                <w:color w:val="1f3864"/>
+                <w:rtl w:val="0"/>
+              </w:rPr>
+              <w:t xml:space="preserve">Entonces:</w:t>
+            </w:r>
+          </w:p>
+        </w:tc>
+        <w:tc>
+          <w:tcPr>
+            <w:gridSpan w:val="4"/>
+            <w:tcBorders>
+              <w:top w:color="000000" w:space="0" w:sz="4" w:val="single"/>
+              <w:left w:color="000000" w:space="0" w:sz="4" w:val="single"/>
+              <w:bottom w:color="000000" w:space="0" w:sz="4" w:val="single"/>
+              <w:right w:color="000000" w:space="0" w:sz="4" w:val="single"/>
+            </w:tcBorders>
+            <w:vAlign w:val="center"/>
+          </w:tcPr>
+          <w:p>
+            <w:pPr>
+              <w:keepNext w:val="0"/>
+              <w:keepLines w:val="0"/>
+              <w:widowControl w:val="1"/>
+              <w:pBdr>
+                <w:top w:space="0" w:sz="0" w:val="nil"/>
+                <w:left w:space="0" w:sz="0" w:val="nil"/>
+                <w:bottom w:space="0" w:sz="0" w:val="nil"/>
+                <w:right w:space="0" w:sz="0" w:val="nil"/>
+                <w:between w:space="0" w:sz="0" w:val="nil"/>
+              </w:pBdr>
+              <w:shd w:fill="auto" w:val="clear"/>
+              <w:spacing w:after="160" w:before="0" w:line="240" w:lineRule="auto"/>
+              <w:ind w:left="0" w:right="0" w:firstLine="0"/>
+              <w:jc w:val="left"/>
+              <w:rPr/>
+            </w:pPr>
+            <w:r>
+              <w:rPr>
+                <w:rtl w:val="0"/>
+              </w:rPr>
+              <w:t xml:space="preserve">el sistema actualiza la información y confirma la modificación</w:t>
+            </w:r>
+          </w:p>
+        </w:tc>
+      </w:tr>
+      <w:tr>
+        <w:trPr>
+          <w:cantSplit w:val="0"/>
+          <w:trHeight w:val="220" w:hRule="atLeast"/>
+          <w:tblHeader w:val="0"/>
+        </w:trPr>
+        <w:tc>
+          <w:tcPr>
+            <w:gridSpan w:val="3"/>
+            <w:vMerge w:val="restart"/>
+            <w:tcBorders>
+              <w:top w:color="000000" w:space="0" w:sz="4" w:val="single"/>
+              <w:left w:color="000000" w:space="0" w:sz="4" w:val="single"/>
+              <w:bottom w:color="000000" w:space="0" w:sz="4" w:val="single"/>
+              <w:right w:color="000000" w:space="0" w:sz="4" w:val="single"/>
+            </w:tcBorders>
+            <w:vAlign w:val="center"/>
+          </w:tcPr>
+          <w:p>
+            <w:pPr>
+              <w:jc w:val="center"/>
+              <w:rPr>
+                <w:b w:val="1"/>
+                <w:bCs w:val="1"/>
+                <w:color w:val="1f3864"/>
+              </w:rPr>
+            </w:pPr>
+            <w:r>
+              <w:rPr>
+                <w:b w:val="1"/>
+                <w:bCs w:val="1"/>
+                <w:color w:val="1f3864"/>
+                <w:rtl w:val="0"/>
+              </w:rPr>
+              <w:t xml:space="preserve">Condición 09</w:t>
+            </w:r>
+          </w:p>
+          <w:p>
+            <w:pPr>
+              <w:jc w:val="center"/>
+              <w:rPr>
+                <w:b w:val="1"/>
+                <w:bCs w:val="1"/>
+                <w:color w:val="1f3864"/>
+              </w:rPr>
+            </w:pPr>
+            <w:r>
+              <w:rPr>
+                <w:rtl w:val="0"/>
+              </w:rPr>
+            </w:r>
+          </w:p>
+        </w:tc>
+        <w:tc>
+          <w:tcPr>
+            <w:gridSpan w:val="2"/>
+            <w:tcBorders>
+              <w:top w:color="000000" w:space="0" w:sz="4" w:val="single"/>
+              <w:left w:color="000000" w:space="0" w:sz="4" w:val="single"/>
+              <w:bottom w:color="000000" w:space="0" w:sz="4" w:val="single"/>
+              <w:right w:color="000000" w:space="0" w:sz="4" w:val="single"/>
+            </w:tcBorders>
+            <w:vAlign w:val="center"/>
+          </w:tcPr>
+          <w:p>
+            <w:pPr>
+              <w:rPr>
+                <w:b w:val="1"/>
+                <w:bCs w:val="1"/>
+                <w:color w:val="1f3864"/>
+              </w:rPr>
+            </w:pPr>
+            <w:r>
+              <w:rPr>
+                <w:b w:val="1"/>
+                <w:bCs w:val="1"/>
+                <w:color w:val="1f3864"/>
+                <w:rtl w:val="0"/>
+              </w:rPr>
+              <w:t xml:space="preserve">Dado:</w:t>
+            </w:r>
+          </w:p>
+        </w:tc>
+        <w:tc>
+          <w:tcPr>
+            <w:gridSpan w:val="4"/>
+            <w:tcBorders>
+              <w:top w:color="000000" w:space="0" w:sz="4" w:val="single"/>
+              <w:left w:color="000000" w:space="0" w:sz="4" w:val="single"/>
+              <w:bottom w:color="000000" w:space="0" w:sz="4" w:val="single"/>
+              <w:right w:color="000000" w:space="0" w:sz="4" w:val="single"/>
+            </w:tcBorders>
+            <w:vAlign w:val="center"/>
+          </w:tcPr>
+          <w:p>
+            <w:pPr>
+              <w:keepNext w:val="0"/>
+              <w:keepLines w:val="0"/>
+              <w:widowControl w:val="1"/>
+              <w:pBdr>
+                <w:top w:space="0" w:sz="0" w:val="nil"/>
+                <w:left w:space="0" w:sz="0" w:val="nil"/>
+                <w:bottom w:space="0" w:sz="0" w:val="nil"/>
+                <w:right w:space="0" w:sz="0" w:val="nil"/>
+                <w:between w:space="0" w:sz="0" w:val="nil"/>
+              </w:pBdr>
+              <w:shd w:fill="auto" w:val="clear"/>
+              <w:spacing w:after="160" w:before="0" w:line="240" w:lineRule="auto"/>
+              <w:ind w:left="0" w:right="0" w:firstLine="0"/>
+              <w:jc w:val="left"/>
+              <w:rPr/>
+            </w:pPr>
+            <w:r>
+              <w:rPr>
+                <w:rtl w:val="0"/>
+              </w:rPr>
+              <w:t xml:space="preserve">que el coordinador intenta inhabilitar un perfil que ya se encuentra inactivo</w:t>
+            </w:r>
+          </w:p>
+        </w:tc>
+      </w:tr>
+      <w:tr>
+        <w:trPr>
+          <w:cantSplit w:val="0"/>
+          <w:trHeight w:val="220" w:hRule="atLeast"/>
+          <w:tblHeader w:val="0"/>
+        </w:trPr>
+        <w:tc>
+          <w:tcPr>
+            <w:gridSpan w:val="3"/>
+            <w:vMerge w:val="continue"/>
+            <w:tcBorders>
+              <w:top w:color="000000" w:space="0" w:sz="4" w:val="single"/>
+              <w:left w:color="000000" w:space="0" w:sz="4" w:val="single"/>
+              <w:bottom w:color="000000" w:space="0" w:sz="4" w:val="single"/>
+              <w:right w:color="000000" w:space="0" w:sz="4" w:val="single"/>
+            </w:tcBorders>
+            <w:vAlign w:val="center"/>
+          </w:tcPr>
+          <w:p>
+            <w:pPr>
+              <w:keepNext w:val="0"/>
+              <w:keepLines w:val="0"/>
+              <w:pageBreakBefore w:val="0"/>
+              <w:widowControl w:val="0"/>
+              <w:pBdr>
+                <w:top w:space="0" w:sz="0" w:val="nil"/>
+                <w:left w:space="0" w:sz="0" w:val="nil"/>
+                <w:bottom w:space="0" w:sz="0" w:val="nil"/>
+                <w:right w:space="0" w:sz="0" w:val="nil"/>
+                <w:between w:space="0" w:sz="0" w:val="nil"/>
+              </w:pBdr>
+              <w:shd w:fill="auto" w:val="clear"/>
+              <w:spacing w:after="0" w:before="0" w:line="276" w:lineRule="auto"/>
+              <w:ind w:left="0" w:right="0" w:firstLine="0"/>
+              <w:jc w:val="left"/>
+              <w:rPr>
+                <w:i w:val="0"/>
+                <w:iCs w:val="0"/>
+                <w:smallCaps w:val="0"/>
+                <w:strike w:val="0"/>
+                <w:color w:val="000000"/>
+                <w:sz w:val="22"/>
+                <w:szCs w:val="22"/>
+                <w:u w:val="none"/>
+                <w:shd w:fill="auto" w:val="clear"/>
+                <w:vertAlign w:val="baseline"/>
+              </w:rPr>
+            </w:pPr>
+            <w:r>
+              <w:rPr>
+                <w:rtl w:val="0"/>
+              </w:rPr>
+            </w:r>
+          </w:p>
+        </w:tc>
+        <w:tc>
+          <w:tcPr>
+            <w:gridSpan w:val="2"/>
+            <w:tcBorders>
+              <w:top w:color="000000" w:space="0" w:sz="4" w:val="single"/>
+              <w:left w:color="000000" w:space="0" w:sz="4" w:val="single"/>
+              <w:bottom w:color="000000" w:space="0" w:sz="4" w:val="single"/>
+              <w:right w:color="000000" w:space="0" w:sz="4" w:val="single"/>
+            </w:tcBorders>
+            <w:vAlign w:val="center"/>
+          </w:tcPr>
+          <w:p>
+            <w:pPr>
+              <w:rPr>
+                <w:b w:val="1"/>
+                <w:bCs w:val="1"/>
+                <w:color w:val="1f3864"/>
+              </w:rPr>
+            </w:pPr>
+            <w:r>
+              <w:rPr>
+                <w:b w:val="1"/>
+                <w:bCs w:val="1"/>
+                <w:color w:val="1f3864"/>
+                <w:rtl w:val="0"/>
+              </w:rPr>
+              <w:t xml:space="preserve">Cuando:</w:t>
+            </w:r>
+          </w:p>
+        </w:tc>
+        <w:tc>
+          <w:tcPr>
+            <w:gridSpan w:val="4"/>
+            <w:tcBorders>
+              <w:top w:color="000000" w:space="0" w:sz="4" w:val="single"/>
+              <w:left w:color="000000" w:space="0" w:sz="4" w:val="single"/>
+              <w:bottom w:color="000000" w:space="0" w:sz="4" w:val="single"/>
+              <w:right w:color="000000" w:space="0" w:sz="4" w:val="single"/>
+            </w:tcBorders>
+            <w:vAlign w:val="center"/>
+          </w:tcPr>
+          <w:p>
+            <w:pPr>
+              <w:keepNext w:val="0"/>
+              <w:keepLines w:val="0"/>
+              <w:widowControl w:val="1"/>
+              <w:pBdr>
+                <w:top w:space="0" w:sz="0" w:val="nil"/>
+                <w:left w:space="0" w:sz="0" w:val="nil"/>
+                <w:bottom w:space="0" w:sz="0" w:val="nil"/>
+                <w:right w:space="0" w:sz="0" w:val="nil"/>
+                <w:between w:space="0" w:sz="0" w:val="nil"/>
+              </w:pBdr>
+              <w:shd w:fill="auto" w:val="clear"/>
+              <w:spacing w:after="160" w:before="0" w:line="240" w:lineRule="auto"/>
+              <w:ind w:left="0" w:right="0" w:firstLine="0"/>
+              <w:jc w:val="left"/>
+              <w:rPr/>
+            </w:pPr>
+            <w:r>
+              <w:rPr>
+                <w:rtl w:val="0"/>
+              </w:rPr>
+              <w:t xml:space="preserve">confirma la acción</w:t>
+            </w:r>
+          </w:p>
+        </w:tc>
+      </w:tr>
+      <w:tr>
+        <w:trPr>
+          <w:cantSplit w:val="0"/>
+          <w:trHeight w:val="220" w:hRule="atLeast"/>
+          <w:tblHeader w:val="0"/>
+        </w:trPr>
+        <w:tc>
+          <w:tcPr>
+            <w:gridSpan w:val="3"/>
+            <w:vMerge w:val="continue"/>
+            <w:tcBorders>
+              <w:top w:color="000000" w:space="0" w:sz="4" w:val="single"/>
+              <w:left w:color="000000" w:space="0" w:sz="4" w:val="single"/>
+              <w:bottom w:color="000000" w:space="0" w:sz="4" w:val="single"/>
+              <w:right w:color="000000" w:space="0" w:sz="4" w:val="single"/>
+            </w:tcBorders>
+            <w:vAlign w:val="center"/>
+          </w:tcPr>
+          <w:p>
+            <w:pPr>
+              <w:keepNext w:val="0"/>
+              <w:keepLines w:val="0"/>
+              <w:pageBreakBefore w:val="0"/>
+              <w:widowControl w:val="0"/>
+              <w:pBdr>
+                <w:top w:space="0" w:sz="0" w:val="nil"/>
+                <w:left w:space="0" w:sz="0" w:val="nil"/>
+                <w:bottom w:space="0" w:sz="0" w:val="nil"/>
+                <w:right w:space="0" w:sz="0" w:val="nil"/>
+                <w:between w:space="0" w:sz="0" w:val="nil"/>
+              </w:pBdr>
+              <w:shd w:fill="auto" w:val="clear"/>
+              <w:spacing w:after="0" w:before="0" w:line="276" w:lineRule="auto"/>
+              <w:ind w:left="0" w:right="0" w:firstLine="0"/>
+              <w:jc w:val="left"/>
+              <w:rPr>
+                <w:i w:val="0"/>
+                <w:iCs w:val="0"/>
+                <w:smallCaps w:val="0"/>
+                <w:strike w:val="0"/>
+                <w:color w:val="000000"/>
+                <w:sz w:val="22"/>
+                <w:szCs w:val="22"/>
+                <w:u w:val="none"/>
+                <w:shd w:fill="auto" w:val="clear"/>
+                <w:vertAlign w:val="baseline"/>
+              </w:rPr>
+            </w:pPr>
+            <w:r>
+              <w:rPr>
+                <w:rtl w:val="0"/>
+              </w:rPr>
+            </w:r>
+          </w:p>
+        </w:tc>
+        <w:tc>
+          <w:tcPr>
+            <w:gridSpan w:val="2"/>
+            <w:tcBorders>
+              <w:top w:color="000000" w:space="0" w:sz="4" w:val="single"/>
+              <w:left w:color="000000" w:space="0" w:sz="4" w:val="single"/>
+              <w:bottom w:color="000000" w:space="0" w:sz="4" w:val="single"/>
+              <w:right w:color="000000" w:space="0" w:sz="4" w:val="single"/>
+            </w:tcBorders>
+            <w:vAlign w:val="center"/>
+          </w:tcPr>
+          <w:p>
+            <w:pPr>
+              <w:rPr>
+                <w:b w:val="1"/>
+                <w:bCs w:val="1"/>
+                <w:color w:val="1f3864"/>
+              </w:rPr>
+            </w:pPr>
+            <w:r>
+              <w:rPr>
+                <w:b w:val="1"/>
+                <w:bCs w:val="1"/>
+                <w:color w:val="1f3864"/>
+                <w:rtl w:val="0"/>
+              </w:rPr>
+              <w:t xml:space="preserve">Entonces:</w:t>
+            </w:r>
+          </w:p>
+        </w:tc>
+        <w:tc>
+          <w:tcPr>
+            <w:gridSpan w:val="4"/>
+            <w:tcBorders>
+              <w:top w:color="000000" w:space="0" w:sz="4" w:val="single"/>
+              <w:left w:color="000000" w:space="0" w:sz="4" w:val="single"/>
+              <w:bottom w:color="000000" w:space="0" w:sz="4" w:val="single"/>
+              <w:right w:color="000000" w:space="0" w:sz="4" w:val="single"/>
+            </w:tcBorders>
+            <w:vAlign w:val="center"/>
+          </w:tcPr>
+          <w:p>
+            <w:pPr>
+              <w:keepNext w:val="0"/>
+              <w:keepLines w:val="0"/>
+              <w:widowControl w:val="1"/>
+              <w:pBdr>
+                <w:top w:space="0" w:sz="0" w:val="nil"/>
+                <w:left w:space="0" w:sz="0" w:val="nil"/>
+                <w:bottom w:space="0" w:sz="0" w:val="nil"/>
+                <w:right w:space="0" w:sz="0" w:val="nil"/>
+                <w:between w:space="0" w:sz="0" w:val="nil"/>
+              </w:pBdr>
+              <w:shd w:fill="auto" w:val="clear"/>
+              <w:spacing w:after="160" w:before="0" w:line="240" w:lineRule="auto"/>
+              <w:ind w:left="0" w:right="0" w:firstLine="0"/>
+              <w:jc w:val="left"/>
+              <w:rPr/>
+            </w:pPr>
+            <w:r>
+              <w:rPr>
+                <w:rtl w:val="0"/>
+              </w:rPr>
+              <w:t xml:space="preserve">el sistema informa que el perfil ya se encuentra inhabilitado</w:t>
+            </w:r>
+          </w:p>
+        </w:tc>
+      </w:tr>
+      <w:tr>
+        <w:trPr>
+          <w:cantSplit w:val="0"/>
+          <w:trHeight w:val="220" w:hRule="atLeast"/>
+          <w:tblHeader w:val="0"/>
+        </w:trPr>
+        <w:tc>
+          <w:tcPr>
+            <w:gridSpan w:val="3"/>
+            <w:vMerge w:val="restart"/>
+            <w:tcBorders>
+              <w:top w:color="000000" w:space="0" w:sz="4" w:val="single"/>
+              <w:left w:color="000000" w:space="0" w:sz="4" w:val="single"/>
+              <w:bottom w:color="000000" w:space="0" w:sz="4" w:val="single"/>
+              <w:right w:color="000000" w:space="0" w:sz="4" w:val="single"/>
+            </w:tcBorders>
+            <w:vAlign w:val="center"/>
+          </w:tcPr>
+          <w:p>
+            <w:pPr>
+              <w:jc w:val="center"/>
+              <w:rPr>
+                <w:b w:val="1"/>
+                <w:bCs w:val="1"/>
+                <w:color w:val="1f3864"/>
+              </w:rPr>
+            </w:pPr>
+            <w:r>
+              <w:rPr>
+                <w:b w:val="1"/>
+                <w:bCs w:val="1"/>
+                <w:color w:val="1f3864"/>
+                <w:rtl w:val="0"/>
+              </w:rPr>
+              <w:t xml:space="preserve">Condición 09</w:t>
+            </w:r>
+          </w:p>
+          <w:p>
+            <w:pPr>
+              <w:jc w:val="center"/>
+              <w:rPr>
+                <w:b w:val="1"/>
+                <w:bCs w:val="1"/>
+                <w:color w:val="1f3864"/>
+              </w:rPr>
+            </w:pPr>
+            <w:r>
+              <w:rPr>
+                <w:rtl w:val="0"/>
+              </w:rPr>
+            </w:r>
+          </w:p>
+        </w:tc>
+        <w:tc>
+          <w:tcPr>
+            <w:gridSpan w:val="2"/>
+            <w:tcBorders>
+              <w:top w:color="000000" w:space="0" w:sz="4" w:val="single"/>
+              <w:left w:color="000000" w:space="0" w:sz="4" w:val="single"/>
+              <w:bottom w:color="000000" w:space="0" w:sz="4" w:val="single"/>
+              <w:right w:color="000000" w:space="0" w:sz="4" w:val="single"/>
+            </w:tcBorders>
+            <w:vAlign w:val="center"/>
+          </w:tcPr>
+          <w:p>
+            <w:pPr>
+              <w:rPr>
+                <w:b w:val="1"/>
+                <w:bCs w:val="1"/>
+                <w:color w:val="1f3864"/>
+              </w:rPr>
+            </w:pPr>
+            <w:r>
+              <w:rPr>
+                <w:b w:val="1"/>
+                <w:bCs w:val="1"/>
+                <w:color w:val="1f3864"/>
+                <w:rtl w:val="0"/>
+              </w:rPr>
+              <w:t xml:space="preserve">Dado:</w:t>
+            </w:r>
+          </w:p>
+        </w:tc>
+        <w:tc>
+          <w:tcPr>
+            <w:gridSpan w:val="4"/>
+            <w:tcBorders>
+              <w:top w:color="000000" w:space="0" w:sz="4" w:val="single"/>
+              <w:left w:color="000000" w:space="0" w:sz="4" w:val="single"/>
+              <w:bottom w:color="000000" w:space="0" w:sz="4" w:val="single"/>
+              <w:right w:color="000000" w:space="0" w:sz="4" w:val="single"/>
+            </w:tcBorders>
+            <w:vAlign w:val="center"/>
+          </w:tcPr>
+          <w:p>
+            <w:pPr>
+              <w:spacing w:line="240" w:lineRule="auto"/>
+              <w:rPr/>
+            </w:pPr>
+            <w:r>
+              <w:rPr>
+                <w:rtl w:val="0"/>
+              </w:rPr>
+              <w:t xml:space="preserve">que el coordinador consulta el perfil de un desarrollador</w:t>
+            </w:r>
+          </w:p>
+        </w:tc>
+      </w:tr>
+      <w:tr>
+        <w:trPr>
+          <w:cantSplit w:val="0"/>
+          <w:trHeight w:val="220" w:hRule="atLeast"/>
+          <w:tblHeader w:val="0"/>
+        </w:trPr>
+        <w:tc>
+          <w:tcPr>
+            <w:gridSpan w:val="3"/>
+            <w:vMerge w:val="continue"/>
+            <w:tcBorders>
+              <w:top w:color="000000" w:space="0" w:sz="4" w:val="single"/>
+              <w:left w:color="000000" w:space="0" w:sz="4" w:val="single"/>
+              <w:bottom w:color="000000" w:space="0" w:sz="4" w:val="single"/>
+              <w:right w:color="000000" w:space="0" w:sz="4" w:val="single"/>
+            </w:tcBorders>
+            <w:vAlign w:val="center"/>
+          </w:tcPr>
+          <w:p>
+            <w:pPr>
+              <w:keepNext w:val="0"/>
+              <w:keepLines w:val="0"/>
+              <w:pageBreakBefore w:val="0"/>
+              <w:widowControl w:val="0"/>
+              <w:pBdr>
+                <w:top w:space="0" w:sz="0" w:val="nil"/>
+                <w:left w:space="0" w:sz="0" w:val="nil"/>
+                <w:bottom w:space="0" w:sz="0" w:val="nil"/>
+                <w:right w:space="0" w:sz="0" w:val="nil"/>
+                <w:between w:space="0" w:sz="0" w:val="nil"/>
+              </w:pBdr>
+              <w:shd w:fill="auto" w:val="clear"/>
+              <w:spacing w:after="0" w:before="0" w:line="276" w:lineRule="auto"/>
+              <w:ind w:left="0" w:right="0" w:firstLine="0"/>
+              <w:jc w:val="left"/>
+              <w:rPr>
+                <w:i w:val="0"/>
+                <w:iCs w:val="0"/>
+                <w:smallCaps w:val="0"/>
+                <w:strike w:val="0"/>
+                <w:color w:val="000000"/>
+                <w:sz w:val="22"/>
+                <w:szCs w:val="22"/>
+                <w:u w:val="none"/>
+                <w:shd w:fill="auto" w:val="clear"/>
+                <w:vertAlign w:val="baseline"/>
+              </w:rPr>
+            </w:pPr>
+            <w:r>
+              <w:rPr>
+                <w:rtl w:val="0"/>
+              </w:rPr>
+            </w:r>
+          </w:p>
+        </w:tc>
+        <w:tc>
+          <w:tcPr>
+            <w:gridSpan w:val="2"/>
+            <w:tcBorders>
+              <w:top w:color="000000" w:space="0" w:sz="4" w:val="single"/>
+              <w:left w:color="000000" w:space="0" w:sz="4" w:val="single"/>
+              <w:bottom w:color="000000" w:space="0" w:sz="4" w:val="single"/>
+              <w:right w:color="000000" w:space="0" w:sz="4" w:val="single"/>
+            </w:tcBorders>
+            <w:vAlign w:val="center"/>
+          </w:tcPr>
+          <w:p>
+            <w:pPr>
+              <w:rPr>
+                <w:b w:val="1"/>
+                <w:bCs w:val="1"/>
+                <w:color w:val="1f3864"/>
+              </w:rPr>
+            </w:pPr>
+            <w:r>
+              <w:rPr>
+                <w:b w:val="1"/>
+                <w:bCs w:val="1"/>
+                <w:color w:val="1f3864"/>
+                <w:rtl w:val="0"/>
+              </w:rPr>
+              <w:t xml:space="preserve">Cuando:</w:t>
+            </w:r>
+          </w:p>
+        </w:tc>
+        <w:tc>
+          <w:tcPr>
+            <w:gridSpan w:val="4"/>
+            <w:tcBorders>
+              <w:top w:color="000000" w:space="0" w:sz="4" w:val="single"/>
+              <w:left w:color="000000" w:space="0" w:sz="4" w:val="single"/>
+              <w:bottom w:color="000000" w:space="0" w:sz="4" w:val="single"/>
+              <w:right w:color="000000" w:space="0" w:sz="4" w:val="single"/>
+            </w:tcBorders>
+            <w:vAlign w:val="center"/>
+          </w:tcPr>
+          <w:p>
+            <w:pPr>
+              <w:spacing w:line="240" w:lineRule="auto"/>
+              <w:rPr/>
+            </w:pPr>
+            <w:r>
+              <w:rPr>
+                <w:rtl w:val="0"/>
+              </w:rPr>
+              <w:t xml:space="preserve">visualiza la información del perfil</w:t>
+            </w:r>
+          </w:p>
+        </w:tc>
+      </w:tr>
+      <w:tr>
+        <w:trPr>
+          <w:cantSplit w:val="0"/>
+          <w:trHeight w:val="220" w:hRule="atLeast"/>
+          <w:tblHeader w:val="0"/>
+        </w:trPr>
+        <w:tc>
+          <w:tcPr>
+            <w:gridSpan w:val="3"/>
+            <w:vMerge w:val="continue"/>
+            <w:tcBorders>
+              <w:top w:color="000000" w:space="0" w:sz="4" w:val="single"/>
+              <w:left w:color="000000" w:space="0" w:sz="4" w:val="single"/>
+              <w:bottom w:color="000000" w:space="0" w:sz="4" w:val="single"/>
+              <w:right w:color="000000" w:space="0" w:sz="4" w:val="single"/>
+            </w:tcBorders>
+            <w:vAlign w:val="center"/>
+          </w:tcPr>
+          <w:p>
+            <w:pPr>
+              <w:keepNext w:val="0"/>
+              <w:keepLines w:val="0"/>
+              <w:pageBreakBefore w:val="0"/>
+              <w:widowControl w:val="0"/>
+              <w:pBdr>
+                <w:top w:space="0" w:sz="0" w:val="nil"/>
+                <w:left w:space="0" w:sz="0" w:val="nil"/>
+                <w:bottom w:space="0" w:sz="0" w:val="nil"/>
+                <w:right w:space="0" w:sz="0" w:val="nil"/>
+                <w:between w:space="0" w:sz="0" w:val="nil"/>
+              </w:pBdr>
+              <w:shd w:fill="auto" w:val="clear"/>
+              <w:spacing w:after="0" w:before="0" w:line="276" w:lineRule="auto"/>
+              <w:ind w:left="0" w:right="0" w:firstLine="0"/>
+              <w:jc w:val="left"/>
+              <w:rPr>
+                <w:i w:val="0"/>
+                <w:iCs w:val="0"/>
+                <w:smallCaps w:val="0"/>
+                <w:strike w:val="0"/>
+                <w:color w:val="000000"/>
+                <w:sz w:val="22"/>
+                <w:szCs w:val="22"/>
+                <w:u w:val="none"/>
+                <w:shd w:fill="auto" w:val="clear"/>
+                <w:vertAlign w:val="baseline"/>
+              </w:rPr>
+            </w:pPr>
+            <w:r>
+              <w:rPr>
+                <w:rtl w:val="0"/>
+              </w:rPr>
+            </w:r>
+          </w:p>
+        </w:tc>
+        <w:tc>
+          <w:tcPr>
+            <w:gridSpan w:val="2"/>
+            <w:tcBorders>
+              <w:top w:color="000000" w:space="0" w:sz="4" w:val="single"/>
+              <w:left w:color="000000" w:space="0" w:sz="4" w:val="single"/>
+              <w:bottom w:color="000000" w:space="0" w:sz="4" w:val="single"/>
+              <w:right w:color="000000" w:space="0" w:sz="4" w:val="single"/>
+            </w:tcBorders>
+            <w:vAlign w:val="center"/>
+          </w:tcPr>
+          <w:p>
+            <w:pPr>
+              <w:rPr>
+                <w:b w:val="1"/>
+                <w:bCs w:val="1"/>
+                <w:color w:val="1f3864"/>
+              </w:rPr>
+            </w:pPr>
+            <w:r>
+              <w:rPr>
+                <w:b w:val="1"/>
+                <w:bCs w:val="1"/>
+                <w:color w:val="1f3864"/>
+                <w:rtl w:val="0"/>
+              </w:rPr>
+              <w:t xml:space="preserve">Entonces:</w:t>
+            </w:r>
+          </w:p>
+        </w:tc>
+        <w:tc>
+          <w:tcPr>
+            <w:gridSpan w:val="4"/>
+            <w:tcBorders>
+              <w:top w:color="000000" w:space="0" w:sz="4" w:val="single"/>
+              <w:left w:color="000000" w:space="0" w:sz="4" w:val="single"/>
+              <w:bottom w:color="000000" w:space="0" w:sz="4" w:val="single"/>
+              <w:right w:color="000000" w:space="0" w:sz="4" w:val="single"/>
+            </w:tcBorders>
+            <w:vAlign w:val="center"/>
+          </w:tcPr>
+          <w:p>
+            <w:pPr>
+              <w:spacing w:line="240" w:lineRule="auto"/>
+              <w:rPr/>
+            </w:pPr>
+            <w:r>
+              <w:rPr>
+                <w:rtl w:val="0"/>
+              </w:rPr>
+              <w:t xml:space="preserve">el sistema muestra los proyectos a los que pertenece o informa que actualmente no tiene proyectos asignados.</w:t>
+            </w:r>
+          </w:p>
+        </w:tc>
+      </w:tr>
+      <w:tr>
+        <w:trPr>
+          <w:cantSplit w:val="0"/>
+          <w:trHeight w:val="220" w:hRule="atLeast"/>
+          <w:tblHeader w:val="0"/>
+        </w:trPr>
+        <w:tc>
+          <w:tcPr>
             <w:gridSpan w:val="9"/>
             <w:tcBorders>
               <w:top w:color="000000" w:space="0" w:sz="4" w:val="single"/>
@@ -3316,7 +5414,6 @@
               <w:ind w:left="0" w:right="0" w:firstLine="0"/>
               <w:jc w:val="center"/>
               <w:rPr>
-                <w:rFonts w:ascii="Calibri" w:cs="Calibri" w:eastAsia="Calibri" w:hAnsi="Calibri"/>
                 <w:b w:val="1"/>
                 <w:bCs w:val="1"/>
                 <w:i w:val="0"/>
@@ -3348,11 +5445,6 @@
                 <w:rtl w:val="0"/>
               </w:rPr>
               <w:t xml:space="preserve">TAREAS</w:t>
-            </w:r>
-            <w:r>
-              <w:rPr>
-                <w:rtl w:val="0"/>
-              </w:rPr>
             </w:r>
           </w:p>
         </w:tc>
@@ -3383,7 +5475,6 @@
               <w:ind w:left="0" w:right="0" w:firstLine="0"/>
               <w:jc w:val="center"/>
               <w:rPr>
-                <w:rFonts w:ascii="Calibri" w:cs="Calibri" w:eastAsia="Calibri" w:hAnsi="Calibri"/>
                 <w:b w:val="1"/>
                 <w:bCs w:val="1"/>
                 <w:i w:val="0"/>
@@ -3416,11 +5507,6 @@
               </w:rPr>
               <w:t xml:space="preserve">No</w:t>
             </w:r>
-            <w:r>
-              <w:rPr>
-                <w:rtl w:val="0"/>
-              </w:rPr>
-            </w:r>
           </w:p>
         </w:tc>
         <w:tc>
@@ -3443,7 +5529,6 @@
               <w:ind w:left="0" w:right="0" w:firstLine="0"/>
               <w:jc w:val="center"/>
               <w:rPr>
-                <w:rFonts w:ascii="Calibri" w:cs="Calibri" w:eastAsia="Calibri" w:hAnsi="Calibri"/>
                 <w:b w:val="1"/>
                 <w:bCs w:val="1"/>
                 <w:i w:val="0"/>
@@ -3475,11 +5560,6 @@
                 <w:rtl w:val="0"/>
               </w:rPr>
               <w:t xml:space="preserve">Descripción</w:t>
-            </w:r>
-            <w:r>
-              <w:rPr>
-                <w:rtl w:val="0"/>
-              </w:rPr>
             </w:r>
           </w:p>
         </w:tc>
@@ -3510,25 +5590,20 @@
               <w:ind w:left="0" w:right="0" w:firstLine="0"/>
               <w:jc w:val="center"/>
               <w:rPr>
-                <w:rFonts w:ascii="Calibri" w:cs="Calibri" w:eastAsia="Calibri" w:hAnsi="Calibri"/>
-                <w:b w:val="0"/>
-                <w:bCs w:val="0"/>
-                <w:i w:val="0"/>
-                <w:iCs w:val="0"/>
-                <w:smallCaps w:val="0"/>
-                <w:strike w:val="0"/>
-                <w:color w:val="1f3864"/>
-                <w:sz w:val="22"/>
-                <w:szCs w:val="22"/>
-                <w:u w:val="none"/>
-                <w:shd w:fill="auto" w:val="clear"/>
-                <w:vertAlign w:val="baseline"/>
-              </w:rPr>
-            </w:pPr>
-            <w:r>
-              <w:rPr>
-                <w:b w:val="0"/>
-                <w:bCs w:val="0"/>
+                <w:i w:val="0"/>
+                <w:iCs w:val="0"/>
+                <w:smallCaps w:val="0"/>
+                <w:strike w:val="0"/>
+                <w:color w:val="1f3864"/>
+                <w:sz w:val="22"/>
+                <w:szCs w:val="22"/>
+                <w:u w:val="none"/>
+                <w:shd w:fill="auto" w:val="clear"/>
+                <w:vertAlign w:val="baseline"/>
+              </w:rPr>
+            </w:pPr>
+            <w:r>
+              <w:rPr>
                 <w:i w:val="0"/>
                 <w:iCs w:val="0"/>
                 <w:smallCaps w:val="0"/>
@@ -3542,11 +5617,6 @@
                 <w:rtl w:val="0"/>
               </w:rPr>
               <w:t xml:space="preserve">1</w:t>
-            </w:r>
-            <w:r>
-              <w:rPr>
-                <w:rtl w:val="0"/>
-              </w:rPr>
             </w:r>
           </w:p>
         </w:tc>
@@ -3570,7 +5640,7 @@
               <w:rPr>
                 <w:rtl w:val="0"/>
               </w:rPr>
-              <w:t xml:space="preserve">Diseñar el formulario de registro de desarrollador con todos los campos</w:t>
+              <w:t xml:space="preserve">Definir las reglas de negocio para la gestión de desarrolladores, incluyendo registro, consulta, actualización, inhabilitación y asignación a proyectos.</w:t>
             </w:r>
           </w:p>
         </w:tc>
@@ -3600,25 +5670,20 @@
               <w:ind w:left="0" w:right="0" w:firstLine="0"/>
               <w:jc w:val="center"/>
               <w:rPr>
-                <w:rFonts w:ascii="Calibri" w:cs="Calibri" w:eastAsia="Calibri" w:hAnsi="Calibri"/>
-                <w:b w:val="0"/>
-                <w:bCs w:val="0"/>
-                <w:i w:val="0"/>
-                <w:iCs w:val="0"/>
-                <w:smallCaps w:val="0"/>
-                <w:strike w:val="0"/>
-                <w:color w:val="1f3864"/>
-                <w:sz w:val="22"/>
-                <w:szCs w:val="22"/>
-                <w:u w:val="none"/>
-                <w:shd w:fill="auto" w:val="clear"/>
-                <w:vertAlign w:val="baseline"/>
-              </w:rPr>
-            </w:pPr>
-            <w:r>
-              <w:rPr>
-                <w:b w:val="0"/>
-                <w:bCs w:val="0"/>
+                <w:i w:val="0"/>
+                <w:iCs w:val="0"/>
+                <w:smallCaps w:val="0"/>
+                <w:strike w:val="0"/>
+                <w:color w:val="1f3864"/>
+                <w:sz w:val="22"/>
+                <w:szCs w:val="22"/>
+                <w:u w:val="none"/>
+                <w:shd w:fill="auto" w:val="clear"/>
+                <w:vertAlign w:val="baseline"/>
+              </w:rPr>
+            </w:pPr>
+            <w:r>
+              <w:rPr>
                 <w:i w:val="0"/>
                 <w:iCs w:val="0"/>
                 <w:smallCaps w:val="0"/>
@@ -3632,11 +5697,6 @@
                 <w:rtl w:val="0"/>
               </w:rPr>
               <w:t xml:space="preserve">2</w:t>
-            </w:r>
-            <w:r>
-              <w:rPr>
-                <w:rtl w:val="0"/>
-              </w:rPr>
             </w:r>
           </w:p>
         </w:tc>
@@ -3659,7 +5719,7 @@
               <w:rPr>
                 <w:rtl w:val="0"/>
               </w:rPr>
-              <w:t xml:space="preserve">Implementar carga y almacenamiento de foto de perfil</w:t>
+              <w:t xml:space="preserve">Diseñar el formulario para el registro y edición de desarrolladores con los campos requeridos por el negocio.</w:t>
             </w:r>
           </w:p>
         </w:tc>
@@ -3689,25 +5749,20 @@
               <w:ind w:left="0" w:right="0" w:firstLine="0"/>
               <w:jc w:val="center"/>
               <w:rPr>
-                <w:rFonts w:ascii="Calibri" w:cs="Calibri" w:eastAsia="Calibri" w:hAnsi="Calibri"/>
-                <w:b w:val="0"/>
-                <w:bCs w:val="0"/>
-                <w:i w:val="0"/>
-                <w:iCs w:val="0"/>
-                <w:smallCaps w:val="0"/>
-                <w:strike w:val="0"/>
-                <w:color w:val="1f3864"/>
-                <w:sz w:val="22"/>
-                <w:szCs w:val="22"/>
-                <w:u w:val="none"/>
-                <w:shd w:fill="auto" w:val="clear"/>
-                <w:vertAlign w:val="baseline"/>
-              </w:rPr>
-            </w:pPr>
-            <w:r>
-              <w:rPr>
-                <w:b w:val="0"/>
-                <w:bCs w:val="0"/>
+                <w:i w:val="0"/>
+                <w:iCs w:val="0"/>
+                <w:smallCaps w:val="0"/>
+                <w:strike w:val="0"/>
+                <w:color w:val="1f3864"/>
+                <w:sz w:val="22"/>
+                <w:szCs w:val="22"/>
+                <w:u w:val="none"/>
+                <w:shd w:fill="auto" w:val="clear"/>
+                <w:vertAlign w:val="baseline"/>
+              </w:rPr>
+            </w:pPr>
+            <w:r>
+              <w:rPr>
                 <w:i w:val="0"/>
                 <w:iCs w:val="0"/>
                 <w:smallCaps w:val="0"/>
@@ -3721,11 +5776,6 @@
                 <w:rtl w:val="0"/>
               </w:rPr>
               <w:t xml:space="preserve">3</w:t>
-            </w:r>
-            <w:r>
-              <w:rPr>
-                <w:rtl w:val="0"/>
-              </w:rPr>
             </w:r>
           </w:p>
         </w:tc>
@@ -3748,7 +5798,7 @@
               <w:rPr>
                 <w:rtl w:val="0"/>
               </w:rPr>
-              <w:t xml:space="preserve">Implementar el endpoint REST de creación de perfil</w:t>
+              <w:t xml:space="preserve">Diseñar la vista de consulta de perfiles mostrando la información del desarrollador, su estado y los proyectos a los que pertenece.</w:t>
             </w:r>
           </w:p>
         </w:tc>
@@ -3778,25 +5828,20 @@
               <w:ind w:left="0" w:right="0" w:firstLine="0"/>
               <w:jc w:val="center"/>
               <w:rPr>
-                <w:rFonts w:ascii="Calibri" w:cs="Calibri" w:eastAsia="Calibri" w:hAnsi="Calibri"/>
-                <w:b w:val="0"/>
-                <w:bCs w:val="0"/>
-                <w:i w:val="0"/>
-                <w:iCs w:val="0"/>
-                <w:smallCaps w:val="0"/>
-                <w:strike w:val="0"/>
-                <w:color w:val="1f3864"/>
-                <w:sz w:val="22"/>
-                <w:szCs w:val="22"/>
-                <w:u w:val="none"/>
-                <w:shd w:fill="auto" w:val="clear"/>
-                <w:vertAlign w:val="baseline"/>
-              </w:rPr>
-            </w:pPr>
-            <w:r>
-              <w:rPr>
-                <w:b w:val="0"/>
-                <w:bCs w:val="0"/>
+                <w:i w:val="0"/>
+                <w:iCs w:val="0"/>
+                <w:smallCaps w:val="0"/>
+                <w:strike w:val="0"/>
+                <w:color w:val="1f3864"/>
+                <w:sz w:val="22"/>
+                <w:szCs w:val="22"/>
+                <w:u w:val="none"/>
+                <w:shd w:fill="auto" w:val="clear"/>
+                <w:vertAlign w:val="baseline"/>
+              </w:rPr>
+            </w:pPr>
+            <w:r>
+              <w:rPr>
                 <w:i w:val="0"/>
                 <w:iCs w:val="0"/>
                 <w:smallCaps w:val="0"/>
@@ -3810,11 +5855,6 @@
                 <w:rtl w:val="0"/>
               </w:rPr>
               <w:t xml:space="preserve">4</w:t>
-            </w:r>
-            <w:r>
-              <w:rPr>
-                <w:rtl w:val="0"/>
-              </w:rPr>
             </w:r>
           </w:p>
         </w:tc>
@@ -3837,7 +5877,7 @@
               <w:rPr>
                 <w:rtl w:val="0"/>
               </w:rPr>
-              <w:t xml:space="preserve">Implementar la búsqueda de desarrolladores por criterios</w:t>
+              <w:t xml:space="preserve">Implementar el servicio para registrar nuevos desarrolladores validando la información obligatoria y las reglas de negocio.</w:t>
             </w:r>
           </w:p>
         </w:tc>
@@ -3867,25 +5907,20 @@
               <w:ind w:left="0" w:right="0" w:firstLine="0"/>
               <w:jc w:val="center"/>
               <w:rPr>
-                <w:rFonts w:ascii="Calibri" w:cs="Calibri" w:eastAsia="Calibri" w:hAnsi="Calibri"/>
-                <w:b w:val="0"/>
-                <w:bCs w:val="0"/>
-                <w:i w:val="0"/>
-                <w:iCs w:val="0"/>
-                <w:smallCaps w:val="0"/>
-                <w:strike w:val="0"/>
-                <w:color w:val="1f3864"/>
-                <w:sz w:val="22"/>
-                <w:szCs w:val="22"/>
-                <w:u w:val="none"/>
-                <w:shd w:fill="auto" w:val="clear"/>
-                <w:vertAlign w:val="baseline"/>
-              </w:rPr>
-            </w:pPr>
-            <w:r>
-              <w:rPr>
-                <w:b w:val="0"/>
-                <w:bCs w:val="0"/>
+                <w:i w:val="0"/>
+                <w:iCs w:val="0"/>
+                <w:smallCaps w:val="0"/>
+                <w:strike w:val="0"/>
+                <w:color w:val="1f3864"/>
+                <w:sz w:val="22"/>
+                <w:szCs w:val="22"/>
+                <w:u w:val="none"/>
+                <w:shd w:fill="auto" w:val="clear"/>
+                <w:vertAlign w:val="baseline"/>
+              </w:rPr>
+            </w:pPr>
+            <w:r>
+              <w:rPr>
                 <w:i w:val="0"/>
                 <w:iCs w:val="0"/>
                 <w:smallCaps w:val="0"/>
@@ -3899,11 +5934,6 @@
                 <w:rtl w:val="0"/>
               </w:rPr>
               <w:t xml:space="preserve">5</w:t>
-            </w:r>
-            <w:r>
-              <w:rPr>
-                <w:rtl w:val="0"/>
-              </w:rPr>
             </w:r>
           </w:p>
         </w:tc>
@@ -3926,7 +5956,7 @@
               <w:rPr>
                 <w:rtl w:val="0"/>
               </w:rPr>
-              <w:t xml:space="preserve">Implementar la modificación de datos del perfil</w:t>
+              <w:t xml:space="preserve">Implementar el servicio para consultar, actualizar e inhabilitar desarrolladores manteniendo la integridad de la información.</w:t>
             </w:r>
           </w:p>
         </w:tc>
@@ -3956,25 +5986,20 @@
               <w:ind w:left="0" w:right="0" w:firstLine="0"/>
               <w:jc w:val="center"/>
               <w:rPr>
-                <w:rFonts w:ascii="Calibri" w:cs="Calibri" w:eastAsia="Calibri" w:hAnsi="Calibri"/>
-                <w:b w:val="0"/>
-                <w:bCs w:val="0"/>
-                <w:i w:val="0"/>
-                <w:iCs w:val="0"/>
-                <w:smallCaps w:val="0"/>
-                <w:strike w:val="0"/>
-                <w:color w:val="1f3864"/>
-                <w:sz w:val="22"/>
-                <w:szCs w:val="22"/>
-                <w:u w:val="none"/>
-                <w:shd w:fill="auto" w:val="clear"/>
-                <w:vertAlign w:val="baseline"/>
-              </w:rPr>
-            </w:pPr>
-            <w:r>
-              <w:rPr>
-                <w:b w:val="0"/>
-                <w:bCs w:val="0"/>
+                <w:i w:val="0"/>
+                <w:iCs w:val="0"/>
+                <w:smallCaps w:val="0"/>
+                <w:strike w:val="0"/>
+                <w:color w:val="1f3864"/>
+                <w:sz w:val="22"/>
+                <w:szCs w:val="22"/>
+                <w:u w:val="none"/>
+                <w:shd w:fill="auto" w:val="clear"/>
+                <w:vertAlign w:val="baseline"/>
+              </w:rPr>
+            </w:pPr>
+            <w:r>
+              <w:rPr>
                 <w:i w:val="0"/>
                 <w:iCs w:val="0"/>
                 <w:smallCaps w:val="0"/>
@@ -3988,11 +6013,6 @@
                 <w:rtl w:val="0"/>
               </w:rPr>
               <w:t xml:space="preserve">6</w:t>
-            </w:r>
-            <w:r>
-              <w:rPr>
-                <w:rtl w:val="0"/>
-              </w:rPr>
             </w:r>
           </w:p>
         </w:tc>
@@ -4015,7 +6035,7 @@
               <w:rPr>
                 <w:rtl w:val="0"/>
               </w:rPr>
-              <w:t xml:space="preserve">Implementar la inhabilitación lógica del desarrollador</w:t>
+              <w:t xml:space="preserve">Implementar las validaciones de unicidad para identificación y correo electrónico, así como las restricciones para la inhabilitación de desarrolladores con actividades pendientes.</w:t>
             </w:r>
           </w:p>
         </w:tc>
@@ -4045,8 +6065,6 @@
               <w:ind w:left="0" w:right="0" w:firstLine="0"/>
               <w:jc w:val="center"/>
               <w:rPr>
-                <w:b w:val="0"/>
-                <w:bCs w:val="0"/>
                 <w:i w:val="0"/>
                 <w:iCs w:val="0"/>
                 <w:smallCaps w:val="0"/>
@@ -4092,7 +6110,441 @@
               <w:rPr>
                 <w:rtl w:val="0"/>
               </w:rPr>
-              <w:t xml:space="preserve">Realizar pruebas de CRUD completo</w:t>
+              <w:t xml:space="preserve">Implementar la consulta de los proyectos y equipos a los que pertenece cada desarrollador.</w:t>
+            </w:r>
+          </w:p>
+        </w:tc>
+      </w:tr>
+      <w:tr>
+        <w:trPr>
+          <w:cantSplit w:val="0"/>
+          <w:trHeight w:val="432" w:hRule="atLeast"/>
+          <w:tblHeader w:val="0"/>
+        </w:trPr>
+        <w:tc>
+          <w:tcPr>
+            <w:gridSpan w:val="3"/>
+            <w:tcBorders>
+              <w:top w:color="000000" w:space="0" w:sz="4" w:val="single"/>
+              <w:left w:color="000000" w:space="0" w:sz="4" w:val="single"/>
+              <w:bottom w:color="000000" w:space="0" w:sz="4" w:val="single"/>
+              <w:right w:color="000000" w:space="0" w:sz="4" w:val="single"/>
+            </w:tcBorders>
+          </w:tcPr>
+          <w:p>
+            <w:pPr>
+              <w:jc w:val="center"/>
+              <w:rPr>
+                <w:color w:val="1f3864"/>
+              </w:rPr>
+            </w:pPr>
+            <w:r>
+              <w:rPr>
+                <w:color w:val="1f3864"/>
+                <w:rtl w:val="0"/>
+              </w:rPr>
+              <w:t xml:space="preserve">8</w:t>
+            </w:r>
+          </w:p>
+        </w:tc>
+        <w:tc>
+          <w:tcPr>
+            <w:gridSpan w:val="6"/>
+            <w:tcBorders>
+              <w:top w:color="000000" w:space="0" w:sz="4" w:val="single"/>
+              <w:left w:color="000000" w:space="0" w:sz="4" w:val="single"/>
+              <w:bottom w:color="000000" w:space="0" w:sz="4" w:val="single"/>
+              <w:right w:color="000000" w:space="0" w:sz="4" w:val="single"/>
+            </w:tcBorders>
+          </w:tcPr>
+          <w:p>
+            <w:pPr>
+              <w:spacing w:after="0" w:line="240" w:lineRule="auto"/>
+              <w:rPr/>
+            </w:pPr>
+            <w:r>
+              <w:rPr>
+                <w:rtl w:val="0"/>
+              </w:rPr>
+              <w:t xml:space="preserve">Implementar el formulario para el registro y edición de desarrolladores siguiendo las reglas de negocio definidas.</w:t>
+            </w:r>
+          </w:p>
+        </w:tc>
+      </w:tr>
+      <w:tr>
+        <w:trPr>
+          <w:cantSplit w:val="0"/>
+          <w:trHeight w:val="432" w:hRule="atLeast"/>
+          <w:tblHeader w:val="0"/>
+        </w:trPr>
+        <w:tc>
+          <w:tcPr>
+            <w:gridSpan w:val="3"/>
+            <w:tcBorders>
+              <w:left w:color="000000" w:space="0" w:sz="4" w:val="single"/>
+              <w:bottom w:color="000000" w:space="0" w:sz="4" w:val="single"/>
+              <w:right w:color="000000" w:space="0" w:sz="4" w:val="single"/>
+            </w:tcBorders>
+          </w:tcPr>
+          <w:p>
+            <w:pPr>
+              <w:jc w:val="center"/>
+              <w:rPr>
+                <w:color w:val="1f3864"/>
+              </w:rPr>
+            </w:pPr>
+            <w:r>
+              <w:rPr>
+                <w:color w:val="1f3864"/>
+                <w:rtl w:val="0"/>
+              </w:rPr>
+              <w:t xml:space="preserve">9</w:t>
+            </w:r>
+          </w:p>
+        </w:tc>
+        <w:tc>
+          <w:tcPr>
+            <w:gridSpan w:val="6"/>
+            <w:tcBorders>
+              <w:left w:color="000000" w:space="0" w:sz="4" w:val="single"/>
+              <w:bottom w:color="000000" w:space="0" w:sz="4" w:val="single"/>
+              <w:right w:color="000000" w:space="0" w:sz="4" w:val="single"/>
+            </w:tcBorders>
+          </w:tcPr>
+          <w:p>
+            <w:pPr>
+              <w:spacing w:after="0" w:line="240" w:lineRule="auto"/>
+              <w:rPr/>
+            </w:pPr>
+            <w:r>
+              <w:rPr>
+                <w:rtl w:val="0"/>
+              </w:rPr>
+              <w:t xml:space="preserve">Implementar la búsqueda, filtrado y consulta de perfiles de desarrolladores.</w:t>
+            </w:r>
+          </w:p>
+        </w:tc>
+      </w:tr>
+      <w:tr>
+        <w:trPr>
+          <w:cantSplit w:val="0"/>
+          <w:trHeight w:val="432" w:hRule="atLeast"/>
+          <w:tblHeader w:val="0"/>
+        </w:trPr>
+        <w:tc>
+          <w:tcPr>
+            <w:gridSpan w:val="3"/>
+            <w:tcBorders>
+              <w:left w:color="000000" w:space="0" w:sz="4" w:val="single"/>
+              <w:bottom w:color="000000" w:space="0" w:sz="4" w:val="single"/>
+              <w:right w:color="000000" w:space="0" w:sz="4" w:val="single"/>
+            </w:tcBorders>
+          </w:tcPr>
+          <w:p>
+            <w:pPr>
+              <w:jc w:val="center"/>
+              <w:rPr>
+                <w:color w:val="1f3864"/>
+              </w:rPr>
+            </w:pPr>
+            <w:r>
+              <w:rPr>
+                <w:color w:val="1f3864"/>
+                <w:rtl w:val="0"/>
+              </w:rPr>
+              <w:t xml:space="preserve">10</w:t>
+            </w:r>
+          </w:p>
+        </w:tc>
+        <w:tc>
+          <w:tcPr>
+            <w:gridSpan w:val="6"/>
+            <w:tcBorders>
+              <w:left w:color="000000" w:space="0" w:sz="4" w:val="single"/>
+              <w:bottom w:color="000000" w:space="0" w:sz="4" w:val="single"/>
+              <w:right w:color="000000" w:space="0" w:sz="4" w:val="single"/>
+            </w:tcBorders>
+          </w:tcPr>
+          <w:p>
+            <w:pPr>
+              <w:spacing w:after="0" w:line="240" w:lineRule="auto"/>
+              <w:rPr/>
+            </w:pPr>
+            <w:r>
+              <w:rPr>
+                <w:rtl w:val="0"/>
+              </w:rPr>
+              <w:t xml:space="preserve">Implementar la visualización del estado del desarrollador y de los proyectos a los que se encuentra asignado.</w:t>
+            </w:r>
+          </w:p>
+        </w:tc>
+      </w:tr>
+      <w:tr>
+        <w:trPr>
+          <w:cantSplit w:val="0"/>
+          <w:trHeight w:val="432" w:hRule="atLeast"/>
+          <w:tblHeader w:val="0"/>
+        </w:trPr>
+        <w:tc>
+          <w:tcPr>
+            <w:gridSpan w:val="3"/>
+            <w:tcBorders>
+              <w:left w:color="000000" w:space="0" w:sz="4" w:val="single"/>
+              <w:bottom w:color="000000" w:space="0" w:sz="4" w:val="single"/>
+              <w:right w:color="000000" w:space="0" w:sz="4" w:val="single"/>
+            </w:tcBorders>
+          </w:tcPr>
+          <w:p>
+            <w:pPr>
+              <w:jc w:val="center"/>
+              <w:rPr>
+                <w:color w:val="1f3864"/>
+              </w:rPr>
+            </w:pPr>
+            <w:r>
+              <w:rPr>
+                <w:color w:val="1f3864"/>
+                <w:rtl w:val="0"/>
+              </w:rPr>
+              <w:t xml:space="preserve">11</w:t>
+            </w:r>
+          </w:p>
+        </w:tc>
+        <w:tc>
+          <w:tcPr>
+            <w:gridSpan w:val="6"/>
+            <w:tcBorders>
+              <w:left w:color="000000" w:space="0" w:sz="4" w:val="single"/>
+              <w:bottom w:color="000000" w:space="0" w:sz="4" w:val="single"/>
+              <w:right w:color="000000" w:space="0" w:sz="4" w:val="single"/>
+            </w:tcBorders>
+          </w:tcPr>
+          <w:p>
+            <w:pPr>
+              <w:spacing w:after="0" w:line="240" w:lineRule="auto"/>
+              <w:rPr/>
+            </w:pPr>
+            <w:r>
+              <w:rPr>
+                <w:rtl w:val="0"/>
+              </w:rPr>
+              <w:t xml:space="preserve">Implementar las acciones para actualizar e inhabilitar desarrolladores mostrando los mensajes de confirmación y validación correspondientes.</w:t>
+            </w:r>
+          </w:p>
+        </w:tc>
+      </w:tr>
+      <w:tr>
+        <w:trPr>
+          <w:cantSplit w:val="0"/>
+          <w:trHeight w:val="432" w:hRule="atLeast"/>
+          <w:tblHeader w:val="0"/>
+        </w:trPr>
+        <w:tc>
+          <w:tcPr>
+            <w:gridSpan w:val="3"/>
+            <w:tcBorders>
+              <w:left w:color="000000" w:space="0" w:sz="4" w:val="single"/>
+              <w:bottom w:color="000000" w:space="0" w:sz="4" w:val="single"/>
+              <w:right w:color="000000" w:space="0" w:sz="4" w:val="single"/>
+            </w:tcBorders>
+          </w:tcPr>
+          <w:p>
+            <w:pPr>
+              <w:jc w:val="center"/>
+              <w:rPr>
+                <w:color w:val="1f3864"/>
+              </w:rPr>
+            </w:pPr>
+            <w:r>
+              <w:rPr>
+                <w:color w:val="1f3864"/>
+                <w:rtl w:val="0"/>
+              </w:rPr>
+              <w:t xml:space="preserve">12</w:t>
+            </w:r>
+          </w:p>
+        </w:tc>
+        <w:tc>
+          <w:tcPr>
+            <w:gridSpan w:val="6"/>
+            <w:tcBorders>
+              <w:left w:color="000000" w:space="0" w:sz="4" w:val="single"/>
+              <w:bottom w:color="000000" w:space="0" w:sz="4" w:val="single"/>
+              <w:right w:color="000000" w:space="0" w:sz="4" w:val="single"/>
+            </w:tcBorders>
+          </w:tcPr>
+          <w:p>
+            <w:pPr>
+              <w:spacing w:after="0" w:line="240" w:lineRule="auto"/>
+              <w:rPr/>
+            </w:pPr>
+            <w:r>
+              <w:rPr>
+                <w:rtl w:val="0"/>
+              </w:rPr>
+              <w:t xml:space="preserve">Verificar el registro exitoso de desarrolladores con información válida y el cumplimiento de las reglas de negocio.</w:t>
+            </w:r>
+          </w:p>
+        </w:tc>
+      </w:tr>
+      <w:tr>
+        <w:trPr>
+          <w:cantSplit w:val="0"/>
+          <w:trHeight w:val="432" w:hRule="atLeast"/>
+          <w:tblHeader w:val="0"/>
+        </w:trPr>
+        <w:tc>
+          <w:tcPr>
+            <w:gridSpan w:val="3"/>
+            <w:tcBorders>
+              <w:left w:color="000000" w:space="0" w:sz="4" w:val="single"/>
+              <w:bottom w:color="000000" w:space="0" w:sz="4" w:val="single"/>
+              <w:right w:color="000000" w:space="0" w:sz="4" w:val="single"/>
+            </w:tcBorders>
+          </w:tcPr>
+          <w:p>
+            <w:pPr>
+              <w:jc w:val="center"/>
+              <w:rPr>
+                <w:color w:val="1f3864"/>
+              </w:rPr>
+            </w:pPr>
+            <w:r>
+              <w:rPr>
+                <w:color w:val="1f3864"/>
+                <w:rtl w:val="0"/>
+              </w:rPr>
+              <w:t xml:space="preserve">13</w:t>
+            </w:r>
+          </w:p>
+        </w:tc>
+        <w:tc>
+          <w:tcPr>
+            <w:gridSpan w:val="6"/>
+            <w:tcBorders>
+              <w:left w:color="000000" w:space="0" w:sz="4" w:val="single"/>
+              <w:bottom w:color="000000" w:space="0" w:sz="4" w:val="single"/>
+              <w:right w:color="000000" w:space="0" w:sz="4" w:val="single"/>
+            </w:tcBorders>
+          </w:tcPr>
+          <w:p>
+            <w:pPr>
+              <w:spacing w:after="0" w:line="240" w:lineRule="auto"/>
+              <w:rPr/>
+            </w:pPr>
+            <w:r>
+              <w:rPr>
+                <w:rtl w:val="0"/>
+              </w:rPr>
+              <w:t xml:space="preserve">Validar la búsqueda, consulta, actualización e inhabilitación de desarrolladores, incluyendo los escenarios de error y restricciones.</w:t>
+            </w:r>
+          </w:p>
+        </w:tc>
+      </w:tr>
+      <w:tr>
+        <w:trPr>
+          <w:cantSplit w:val="0"/>
+          <w:trHeight w:val="432" w:hRule="atLeast"/>
+          <w:tblHeader w:val="0"/>
+        </w:trPr>
+        <w:tc>
+          <w:tcPr>
+            <w:gridSpan w:val="3"/>
+            <w:tcBorders>
+              <w:left w:color="000000" w:space="0" w:sz="4" w:val="single"/>
+              <w:bottom w:color="000000" w:space="0" w:sz="4" w:val="single"/>
+              <w:right w:color="000000" w:space="0" w:sz="4" w:val="single"/>
+            </w:tcBorders>
+          </w:tcPr>
+          <w:p>
+            <w:pPr>
+              <w:jc w:val="center"/>
+              <w:rPr>
+                <w:color w:val="1f3864"/>
+              </w:rPr>
+            </w:pPr>
+            <w:r>
+              <w:rPr>
+                <w:color w:val="1f3864"/>
+                <w:rtl w:val="0"/>
+              </w:rPr>
+              <w:t xml:space="preserve">14</w:t>
+            </w:r>
+          </w:p>
+        </w:tc>
+        <w:tc>
+          <w:tcPr>
+            <w:gridSpan w:val="6"/>
+            <w:tcBorders>
+              <w:left w:color="000000" w:space="0" w:sz="4" w:val="single"/>
+              <w:bottom w:color="000000" w:space="0" w:sz="4" w:val="single"/>
+              <w:right w:color="000000" w:space="0" w:sz="4" w:val="single"/>
+            </w:tcBorders>
+          </w:tcPr>
+          <w:p>
+            <w:pPr>
+              <w:spacing w:after="0" w:line="240" w:lineRule="auto"/>
+              <w:rPr/>
+            </w:pPr>
+            <w:r>
+              <w:rPr>
+                <w:rtl w:val="0"/>
+              </w:rPr>
+              <w:t xml:space="preserve">Ejecutar pruebas funcionales para verificar la correcta gestión de desarrolladores, la visualización de proyectos asociados y el cumplimiento de las reglas de negocio.</w:t>
+            </w:r>
+          </w:p>
+        </w:tc>
+      </w:tr>
+      <w:tr>
+        <w:trPr>
+          <w:cantSplit w:val="0"/>
+          <w:trHeight w:val="432" w:hRule="atLeast"/>
+          <w:tblHeader w:val="0"/>
+        </w:trPr>
+        <w:tc>
+          <w:tcPr>
+            <w:gridSpan w:val="3"/>
+            <w:tcBorders>
+              <w:left w:color="000000" w:space="0" w:sz="4" w:val="single"/>
+              <w:bottom w:color="000000" w:space="0" w:sz="4" w:val="single"/>
+              <w:right w:color="000000" w:space="0" w:sz="4" w:val="single"/>
+            </w:tcBorders>
+          </w:tcPr>
+          <w:p>
+            <w:pPr>
+              <w:jc w:val="center"/>
+              <w:rPr>
+                <w:color w:val="1f3864"/>
+              </w:rPr>
+            </w:pPr>
+            <w:r>
+              <w:rPr>
+                <w:color w:val="1f3864"/>
+                <w:rtl w:val="0"/>
+              </w:rPr>
+              <w:t xml:space="preserve">15</w:t>
+            </w:r>
+          </w:p>
+        </w:tc>
+        <w:tc>
+          <w:tcPr>
+            <w:gridSpan w:val="6"/>
+            <w:tcBorders>
+              <w:left w:color="000000" w:space="0" w:sz="4" w:val="single"/>
+              <w:bottom w:color="000000" w:space="0" w:sz="4" w:val="single"/>
+              <w:right w:color="000000" w:space="0" w:sz="4" w:val="single"/>
+            </w:tcBorders>
+          </w:tcPr>
+          <w:p>
+            <w:pPr>
+              <w:spacing w:after="0" w:line="240" w:lineRule="auto"/>
+              <w:rPr/>
+            </w:pPr>
+            <w:r>
+              <w:rPr>
+                <w:rtl w:val="0"/>
+              </w:rPr>
+              <w:t xml:space="preserve">Validar reglas de negocio y mensajes de error, asegurando los estándares de dominio establecidos.</w:t>
             </w:r>
           </w:p>
         </w:tc>
@@ -4123,7 +6575,6 @@
               <w:ind w:left="0" w:right="0" w:firstLine="0"/>
               <w:jc w:val="center"/>
               <w:rPr>
-                <w:rFonts w:ascii="Calibri" w:cs="Calibri" w:eastAsia="Calibri" w:hAnsi="Calibri"/>
                 <w:b w:val="1"/>
                 <w:bCs w:val="1"/>
                 <w:i w:val="0"/>
@@ -4155,11 +6606,6 @@
                 <w:rtl w:val="0"/>
               </w:rPr>
               <w:t xml:space="preserve">CONTROL DE VERSIONES</w:t>
-            </w:r>
-            <w:r>
-              <w:rPr>
-                <w:rtl w:val="0"/>
-              </w:rPr>
             </w:r>
           </w:p>
         </w:tc>
@@ -4190,7 +6636,6 @@
               <w:ind w:left="0" w:right="0" w:firstLine="0"/>
               <w:jc w:val="center"/>
               <w:rPr>
-                <w:rFonts w:ascii="Calibri" w:cs="Calibri" w:eastAsia="Calibri" w:hAnsi="Calibri"/>
                 <w:b w:val="1"/>
                 <w:bCs w:val="1"/>
                 <w:i w:val="0"/>
@@ -4223,11 +6668,6 @@
               </w:rPr>
               <w:t xml:space="preserve">Versión</w:t>
             </w:r>
-            <w:r>
-              <w:rPr>
-                <w:rtl w:val="0"/>
-              </w:rPr>
-            </w:r>
           </w:p>
         </w:tc>
         <w:tc>
@@ -4250,7 +6690,6 @@
               <w:ind w:left="0" w:right="0" w:firstLine="0"/>
               <w:jc w:val="center"/>
               <w:rPr>
-                <w:rFonts w:ascii="Calibri" w:cs="Calibri" w:eastAsia="Calibri" w:hAnsi="Calibri"/>
                 <w:b w:val="1"/>
                 <w:bCs w:val="1"/>
                 <w:i w:val="0"/>
@@ -4283,11 +6722,6 @@
               </w:rPr>
               <w:t xml:space="preserve">Fecha</w:t>
             </w:r>
-            <w:r>
-              <w:rPr>
-                <w:rtl w:val="0"/>
-              </w:rPr>
-            </w:r>
           </w:p>
         </w:tc>
         <w:tc>
@@ -4310,7 +6744,6 @@
               <w:ind w:left="0" w:right="0" w:firstLine="0"/>
               <w:jc w:val="center"/>
               <w:rPr>
-                <w:rFonts w:ascii="Calibri" w:cs="Calibri" w:eastAsia="Calibri" w:hAnsi="Calibri"/>
                 <w:b w:val="1"/>
                 <w:bCs w:val="1"/>
                 <w:i w:val="0"/>
@@ -4343,11 +6776,6 @@
               </w:rPr>
               <w:t xml:space="preserve">Autor</w:t>
             </w:r>
-            <w:r>
-              <w:rPr>
-                <w:rtl w:val="0"/>
-              </w:rPr>
-            </w:r>
           </w:p>
         </w:tc>
         <w:tc>
@@ -4369,7 +6797,6 @@
               <w:ind w:left="0" w:right="0" w:firstLine="0"/>
               <w:jc w:val="center"/>
               <w:rPr>
-                <w:rFonts w:ascii="Calibri" w:cs="Calibri" w:eastAsia="Calibri" w:hAnsi="Calibri"/>
                 <w:b w:val="1"/>
                 <w:bCs w:val="1"/>
                 <w:i w:val="0"/>
@@ -4402,11 +6829,6 @@
               </w:rPr>
               <w:t xml:space="preserve">Revisión</w:t>
             </w:r>
-            <w:r>
-              <w:rPr>
-                <w:rtl w:val="0"/>
-              </w:rPr>
-            </w:r>
           </w:p>
         </w:tc>
         <w:tc>
@@ -4428,7 +6850,6 @@
               <w:ind w:left="0" w:right="0" w:firstLine="0"/>
               <w:jc w:val="center"/>
               <w:rPr>
-                <w:rFonts w:ascii="Calibri" w:cs="Calibri" w:eastAsia="Calibri" w:hAnsi="Calibri"/>
                 <w:b w:val="1"/>
                 <w:bCs w:val="1"/>
                 <w:i w:val="0"/>
@@ -4461,11 +6882,6 @@
               </w:rPr>
               <w:t xml:space="preserve">Descripción</w:t>
             </w:r>
-            <w:r>
-              <w:rPr>
-                <w:rtl w:val="0"/>
-              </w:rPr>
-            </w:r>
           </w:p>
         </w:tc>
         <w:tc>
@@ -4487,7 +6903,6 @@
               <w:ind w:left="0" w:right="0" w:firstLine="0"/>
               <w:jc w:val="center"/>
               <w:rPr>
-                <w:rFonts w:ascii="Calibri" w:cs="Calibri" w:eastAsia="Calibri" w:hAnsi="Calibri"/>
                 <w:b w:val="1"/>
                 <w:bCs w:val="1"/>
                 <w:i w:val="0"/>
@@ -4519,11 +6934,6 @@
                 <w:rtl w:val="0"/>
               </w:rPr>
               <w:t xml:space="preserve">Aprobador</w:t>
-            </w:r>
-            <w:r>
-              <w:rPr>
-                <w:rtl w:val="0"/>
-              </w:rPr>
             </w:r>
           </w:p>
         </w:tc>
@@ -4554,9 +6964,6 @@
               <w:ind w:left="0" w:right="0" w:firstLine="0"/>
               <w:jc w:val="center"/>
               <w:rPr>
-                <w:rFonts w:ascii="Calibri" w:cs="Calibri" w:eastAsia="Calibri" w:hAnsi="Calibri"/>
-                <w:b w:val="0"/>
-                <w:bCs w:val="0"/>
                 <w:i w:val="0"/>
                 <w:iCs w:val="0"/>
                 <w:smallCaps w:val="0"/>
@@ -4602,9 +7009,6 @@
               <w:ind w:left="0" w:right="0" w:firstLine="0"/>
               <w:jc w:val="center"/>
               <w:rPr>
-                <w:rFonts w:ascii="Calibri" w:cs="Calibri" w:eastAsia="Calibri" w:hAnsi="Calibri"/>
-                <w:b w:val="0"/>
-                <w:bCs w:val="0"/>
                 <w:i w:val="0"/>
                 <w:iCs w:val="0"/>
                 <w:smallCaps w:val="0"/>
@@ -4650,9 +7054,6 @@
               <w:ind w:left="0" w:right="0" w:firstLine="0"/>
               <w:jc w:val="center"/>
               <w:rPr>
-                <w:rFonts w:ascii="Calibri" w:cs="Calibri" w:eastAsia="Calibri" w:hAnsi="Calibri"/>
-                <w:b w:val="0"/>
-                <w:bCs w:val="0"/>
                 <w:i w:val="0"/>
                 <w:iCs w:val="0"/>
                 <w:smallCaps w:val="0"/>
@@ -4697,9 +7098,6 @@
               <w:ind w:left="0" w:right="0" w:firstLine="0"/>
               <w:jc w:val="center"/>
               <w:rPr>
-                <w:rFonts w:ascii="Calibri" w:cs="Calibri" w:eastAsia="Calibri" w:hAnsi="Calibri"/>
-                <w:b w:val="0"/>
-                <w:bCs w:val="0"/>
                 <w:i w:val="0"/>
                 <w:iCs w:val="0"/>
                 <w:smallCaps w:val="0"/>
@@ -4766,9 +7164,6 @@
               <w:ind w:left="0" w:right="0" w:firstLine="0"/>
               <w:jc w:val="center"/>
               <w:rPr>
-                <w:rFonts w:ascii="Calibri" w:cs="Calibri" w:eastAsia="Calibri" w:hAnsi="Calibri"/>
-                <w:b w:val="0"/>
-                <w:bCs w:val="0"/>
                 <w:i w:val="0"/>
                 <w:iCs w:val="0"/>
                 <w:smallCaps w:val="0"/>
@@ -4780,6 +7175,146 @@
                 <w:shd w:fill="auto" w:val="clear"/>
                 <w:vertAlign w:val="baseline"/>
               </w:rPr>
+            </w:pPr>
+            <w:r>
+              <w:rPr>
+                <w:rtl w:val="0"/>
+              </w:rPr>
+            </w:r>
+          </w:p>
+        </w:tc>
+      </w:tr>
+      <w:tr>
+        <w:trPr>
+          <w:cantSplit w:val="0"/>
+          <w:trHeight w:val="220" w:hRule="atLeast"/>
+          <w:tblHeader w:val="0"/>
+        </w:trPr>
+        <w:tc>
+          <w:tcPr>
+            <w:gridSpan w:val="2"/>
+            <w:tcBorders>
+              <w:top w:color="000000" w:space="0" w:sz="4" w:val="single"/>
+              <w:left w:color="000000" w:space="0" w:sz="4" w:val="single"/>
+              <w:bottom w:color="000000" w:space="0" w:sz="4" w:val="single"/>
+              <w:right w:color="000000" w:space="0" w:sz="4" w:val="single"/>
+            </w:tcBorders>
+          </w:tcPr>
+          <w:p>
+            <w:pPr>
+              <w:jc w:val="center"/>
+              <w:rPr/>
+            </w:pPr>
+            <w:r>
+              <w:rPr>
+                <w:rtl w:val="0"/>
+              </w:rPr>
+              <w:t xml:space="preserve">2.0</w:t>
+            </w:r>
+          </w:p>
+        </w:tc>
+        <w:tc>
+          <w:tcPr>
+            <w:gridSpan w:val="2"/>
+            <w:tcBorders>
+              <w:top w:color="000000" w:space="0" w:sz="4" w:val="single"/>
+              <w:left w:color="000000" w:space="0" w:sz="4" w:val="single"/>
+              <w:bottom w:color="000000" w:space="0" w:sz="4" w:val="single"/>
+              <w:right w:color="000000" w:space="0" w:sz="4" w:val="single"/>
+            </w:tcBorders>
+          </w:tcPr>
+          <w:p>
+            <w:pPr>
+              <w:jc w:val="center"/>
+              <w:rPr/>
+            </w:pPr>
+            <w:r>
+              <w:rPr>
+                <w:rtl w:val="0"/>
+              </w:rPr>
+              <w:t xml:space="preserve">04/07/2026</w:t>
+            </w:r>
+          </w:p>
+        </w:tc>
+        <w:tc>
+          <w:tcPr>
+            <w:gridSpan w:val="2"/>
+            <w:tcBorders>
+              <w:top w:color="000000" w:space="0" w:sz="4" w:val="single"/>
+              <w:left w:color="000000" w:space="0" w:sz="4" w:val="single"/>
+              <w:bottom w:color="000000" w:space="0" w:sz="4" w:val="single"/>
+              <w:right w:color="000000" w:space="0" w:sz="4" w:val="single"/>
+            </w:tcBorders>
+          </w:tcPr>
+          <w:p>
+            <w:pPr>
+              <w:jc w:val="center"/>
+              <w:rPr/>
+            </w:pPr>
+            <w:r>
+              <w:rPr>
+                <w:rtl w:val="0"/>
+              </w:rPr>
+              <w:t xml:space="preserve">Efrain Manotas</w:t>
+            </w:r>
+          </w:p>
+        </w:tc>
+        <w:tc>
+          <w:tcPr>
+            <w:tcBorders>
+              <w:top w:color="000000" w:space="0" w:sz="4" w:val="single"/>
+              <w:left w:color="000000" w:space="0" w:sz="4" w:val="single"/>
+              <w:bottom w:color="000000" w:space="0" w:sz="4" w:val="single"/>
+              <w:right w:color="000000" w:space="0" w:sz="4" w:val="single"/>
+            </w:tcBorders>
+          </w:tcPr>
+          <w:p>
+            <w:pPr>
+              <w:jc w:val="center"/>
+              <w:rPr/>
+            </w:pPr>
+            <w:r>
+              <w:rPr>
+                <w:rtl w:val="0"/>
+              </w:rPr>
+            </w:r>
+          </w:p>
+        </w:tc>
+        <w:tc>
+          <w:tcPr>
+            <w:tcBorders>
+              <w:top w:color="000000" w:space="0" w:sz="4" w:val="single"/>
+              <w:left w:color="000000" w:space="0" w:sz="4" w:val="single"/>
+              <w:bottom w:color="000000" w:space="0" w:sz="4" w:val="single"/>
+              <w:right w:color="000000" w:space="0" w:sz="4" w:val="single"/>
+            </w:tcBorders>
+          </w:tcPr>
+          <w:p>
+            <w:pPr>
+              <w:jc w:val="center"/>
+              <w:rPr/>
+            </w:pPr>
+            <w:r>
+              <w:rPr>
+                <w:rtl w:val="0"/>
+              </w:rPr>
+              <w:t xml:space="preserve">Revisión e implementación de mejoras HU-05</w:t>
+            </w:r>
+          </w:p>
+        </w:tc>
+        <w:tc>
+          <w:tcPr>
+            <w:tcBorders>
+              <w:top w:color="000000" w:space="0" w:sz="4" w:val="single"/>
+              <w:left w:color="000000" w:space="0" w:sz="4" w:val="single"/>
+              <w:bottom w:color="000000" w:space="0" w:sz="4" w:val="single"/>
+              <w:right w:color="000000" w:space="0" w:sz="4" w:val="single"/>
+            </w:tcBorders>
+          </w:tcPr>
+          <w:p>
+            <w:pPr>
+              <w:jc w:val="center"/>
+              <w:rPr/>
             </w:pPr>
             <w:r>
               <w:rPr>
@@ -4801,9 +7336,6 @@
         <w:ind w:left="0" w:right="0" w:firstLine="0"/>
         <w:jc w:val="left"/>
         <w:rPr>
-          <w:rFonts w:ascii="Calibri" w:cs="Calibri" w:eastAsia="Calibri" w:hAnsi="Calibri"/>
-          <w:b w:val="0"/>
-          <w:bCs w:val="0"/>
           <w:i w:val="0"/>
           <w:iCs w:val="0"/>
           <w:smallCaps w:val="0"/>

</xml_diff>